<commit_message>
Add Section 6, use-case model
Added the use-case catalogue, the use-case diagram and the detailed use case for Allocate Berth.
</commit_message>
<xml_diff>
--- a/report/section6-use-cases.docx
+++ b/report/section6-use-cases.docx
@@ -21,6 +21,9 @@
       <w:pPr>
         <w:keepNext/>
         <w:spacing w:before="280" w:after="120"/>
+        <w:rPr>
+          <w:lang w:val="ru-RU"/>
+        </w:rPr>
       </w:pPr>
       <w:r>
         <w:rPr>
@@ -31,21 +34,6 @@
           <w:szCs w:val="26"/>
         </w:rPr>
         <w:t>6.1 Use-case catalogue</w:t>
-      </w:r>
-    </w:p>
-    <w:p>
-      <w:pPr>
-        <w:spacing w:after="140"/>
-      </w:pPr>
-      <w:r>
-        <w:rPr>
-          <w:i/>
-          <w:iCs/>
-          <w:color w:val="595959"/>
-          <w:sz w:val="19"/>
-          <w:szCs w:val="19"/>
-        </w:rPr>
-        <w:t xml:space="preserve">Based on: Session 4 lecture (“What is a use case?”, “Good use-case names”, “Weak use-case names”) and Session 4 Lab Part C Task 7 (use-case catalogue). </w:t>
       </w:r>
     </w:p>
     <w:tbl>
@@ -63,7 +51,7 @@
           <w:left w:w="10" w:type="dxa"/>
           <w:right w:w="10" w:type="dxa"/>
         </w:tblCellMar>
-        <w:tblLook w:val="04A0" w:firstRow="1" w:lastRow="0" w:firstColumn="1" w:lastColumn="0" w:noHBand="0" w:noVBand="1"/>
+        <w:tblLook w:val="0000" w:firstRow="0" w:lastRow="0" w:firstColumn="0" w:lastColumn="0" w:noHBand="0" w:noVBand="0"/>
       </w:tblPr>
       <w:tblGrid>
         <w:gridCol w:w="900"/>
@@ -634,18 +622,9 @@
           <w:p>
             <w:pPr>
               <w:spacing w:after="40"/>
-              <w:rPr>
-                <w:lang w:val="ru-RU"/>
-              </w:rPr>
-            </w:pPr>
-            <w:r>
-              <w:t>FR03, FR</w:t>
-            </w:r>
-            <w:r>
-              <w:rPr>
-                <w:lang w:val="ru-RU"/>
-              </w:rPr>
-              <w:t>22</w:t>
+            </w:pPr>
+            <w:r>
+              <w:t>FR03, FR22</w:t>
             </w:r>
           </w:p>
         </w:tc>
@@ -2116,7 +2095,7 @@
               <w:spacing w:after="40"/>
             </w:pPr>
             <w:r>
-              <w:t>Provisional arrivals, berth conflicts and equipment status are seen in one place</w:t>
+              <w:t>Provisional arrivals, berth conflicts, equipment readiness and location, restrictions, delayed departures and unresolved inspections are seen in one place</w:t>
             </w:r>
           </w:p>
         </w:tc>
@@ -2297,8 +2276,22 @@
           <w:szCs w:val="26"/>
         </w:rPr>
         <w:lastRenderedPageBreak/>
-        <w:t>Note on FR03, FR04, FR10 and FR</w:t>
+        <w:t>Note on primary actors</w:t>
       </w:r>
+    </w:p>
+    <w:p>
+      <w:pPr>
+        <w:spacing w:after="100"/>
+      </w:pPr>
+      <w:r>
+        <w:t>The scenario does not say which staff role records berth requests, confirms them, records harbour notices, reserves equipment or issues equipment. The primary actors for UC01, UC02, UC03, UC06, UC07 and UC09 are my own decision, not a fact from the scenario. The open questions are Q27 (requests and issuing equipment), Q24 (confirming requests), Q20 (harbour notices and restrictions) and Q05 (reserving equipment), see Sections 1.1 and 5. The other primary actors follow the stakeholder quotes and goals in Section 3.</w:t>
+      </w:r>
+    </w:p>
+    <w:p>
+      <w:pPr>
+        <w:keepNext/>
+        <w:spacing w:before="280" w:after="120"/>
+      </w:pPr>
       <w:r>
         <w:rPr>
           <w:b/>
@@ -2307,7 +2300,7 @@
           <w:sz w:val="26"/>
           <w:szCs w:val="26"/>
         </w:rPr>
-        <w:t>22</w:t>
+        <w:t>Note on FR03, FR04, FR10, FR15 and FR22</w:t>
       </w:r>
     </w:p>
     <w:p>
@@ -2315,13 +2308,7 @@
         <w:spacing w:after="100"/>
       </w:pPr>
       <w:r>
-        <w:t>Confirm Berth Request has two outcomes: the request is confirmed (FR</w:t>
-      </w:r>
-      <w:r>
-        <w:t>22</w:t>
-      </w:r>
-      <w:r>
-        <w:t>), or it stays provisional while a check is missing (FR03). This follows Request Activity Place in the Session 4 sample answer, which records a confirmed place or a waiting-list outcome. Who may confirm a request is still open (Q24).</w:t>
+        <w:t>Confirm Berth Request has two outcomes: the request is confirmed (FR22), or it stays provisional while a check is missing (FR03). This follows Request Activity Place in the Session 4 sample answer, which records a confirmed place or a waiting-list outcome. Who may confirm a request is still open (Q24).</w:t>
       </w:r>
     </w:p>
     <w:p>
@@ -2351,22 +2338,2205 @@
     <w:p>
       <w:pPr>
         <w:spacing w:after="100"/>
+      </w:pPr>
+      <w:r>
+        <w:t>Every Must, Should and Could functional requirement (FR01–FR17 and FR22) and NFR01 appears in at least one use case. FR18–FR21 are Won’t items for this release, so they have no use case. The other non-functional requirements (NFR02–NFR06) describe qualities of the system, not actor goals, so they stay in the requirements catalogue (Section 4).</w:t>
+      </w:r>
+    </w:p>
+    <w:p>
+      <w:pPr>
+        <w:sectPr>
+          <w:footerReference w:type="default" r:id="rId7"/>
+          <w:pgSz w:w="16838" w:h="11906" w:orient="landscape"/>
+          <w:pgMar w:top="864" w:right="720" w:bottom="864" w:left="720" w:header="708" w:footer="708" w:gutter="0"/>
+          <w:cols w:space="720"/>
+          <w:docGrid w:linePitch="360"/>
+        </w:sectPr>
+      </w:pPr>
+    </w:p>
+    <w:p>
+      <w:pPr>
+        <w:keepNext/>
+        <w:spacing w:before="280" w:after="120"/>
+      </w:pPr>
+      <w:r>
         <w:rPr>
-          <w:sz w:val="22"/>
-          <w:szCs w:val="22"/>
+          <w:b/>
+          <w:bCs/>
+          <w:color w:val="404040"/>
+          <w:sz w:val="26"/>
+          <w:szCs w:val="26"/>
+        </w:rPr>
+        <w:lastRenderedPageBreak/>
+        <w:t>6.2 Use-case diagram</w:t>
+      </w:r>
+    </w:p>
+    <w:p>
+      <w:pPr>
+        <w:spacing w:after="140"/>
+        <w:rPr>
+          <w:lang w:val="ru-RU"/>
         </w:rPr>
       </w:pPr>
       <w:r>
         <w:rPr>
-          <w:color w:val="000000"/>
+          <w:i/>
+          <w:iCs/>
+          <w:color w:val="595959"/>
+          <w:sz w:val="19"/>
+          <w:szCs w:val="19"/>
+        </w:rPr>
+        <w:t>Based on: Session 4 lecture</w:t>
+      </w:r>
+    </w:p>
+    <w:p>
+      <w:pPr>
+        <w:jc w:val="center"/>
+      </w:pPr>
+      <w:r>
+        <w:rPr>
+          <w:noProof/>
+        </w:rPr>
+        <w:drawing>
+          <wp:inline distT="0" distB="0" distL="0" distR="0" wp14:anchorId="0E926227" wp14:editId="20CC2E6A">
+            <wp:extent cx="3771900" cy="8229600"/>
+            <wp:effectExtent l="0" t="0" r="0" b="0"/>
+            <wp:docPr id="1" name="Picture 1"/>
+            <wp:cNvGraphicFramePr>
+              <a:graphicFrameLocks xmlns:a="http://schemas.openxmlformats.org/drawingml/2006/main" noChangeAspect="1"/>
+            </wp:cNvGraphicFramePr>
+            <a:graphic xmlns:a="http://schemas.openxmlformats.org/drawingml/2006/main">
+              <a:graphicData uri="http://schemas.openxmlformats.org/drawingml/2006/picture">
+                <pic:pic xmlns:pic="http://schemas.openxmlformats.org/drawingml/2006/picture">
+                  <pic:nvPicPr>
+                    <pic:cNvPr id="0" name=""/>
+                    <pic:cNvPicPr>
+                      <a:picLocks noChangeAspect="1" noChangeArrowheads="1"/>
+                    </pic:cNvPicPr>
+                  </pic:nvPicPr>
+                  <pic:blipFill>
+                    <a:blip r:embed="rId8"/>
+                    <a:srcRect/>
+                    <a:stretch>
+                      <a:fillRect/>
+                    </a:stretch>
+                  </pic:blipFill>
+                  <pic:spPr bwMode="auto">
+                    <a:xfrm>
+                      <a:off x="0" y="0"/>
+                      <a:ext cx="3771900" cy="8229600"/>
+                    </a:xfrm>
+                    <a:prstGeom prst="rect">
+                      <a:avLst/>
+                    </a:prstGeom>
+                  </pic:spPr>
+                </pic:pic>
+              </a:graphicData>
+            </a:graphic>
+          </wp:inline>
+        </w:drawing>
+      </w:r>
+    </w:p>
+    <w:p>
+      <w:pPr>
+        <w:sectPr>
+          <w:footerReference w:type="default" r:id="rId9"/>
+          <w:pgSz w:w="11906" w:h="16838"/>
+          <w:pgMar w:top="720" w:right="1080" w:bottom="720" w:left="1080" w:header="708" w:footer="708" w:gutter="0"/>
+          <w:cols w:space="720"/>
+          <w:docGrid w:linePitch="360"/>
+        </w:sectPr>
+      </w:pPr>
+    </w:p>
+    <w:p>
+      <w:pPr>
+        <w:keepNext/>
+        <w:spacing w:before="280" w:after="120"/>
+      </w:pPr>
+      <w:r>
+        <w:rPr>
+          <w:b/>
+          <w:bCs/>
+          <w:color w:val="404040"/>
+          <w:sz w:val="26"/>
+          <w:szCs w:val="26"/>
+        </w:rPr>
+        <w:lastRenderedPageBreak/>
+        <w:t>Diagram justification</w:t>
+      </w:r>
+    </w:p>
+    <w:p>
+      <w:pPr>
+        <w:pStyle w:val="ListParagraph"/>
+        <w:numPr>
+          <w:ilvl w:val="0"/>
+          <w:numId w:val="2"/>
+        </w:numPr>
+        <w:spacing w:after="60"/>
+      </w:pPr>
+      <w:r>
+        <w:t>All actors appear outside the system boundary.</w:t>
+      </w:r>
+    </w:p>
+    <w:p>
+      <w:pPr>
+        <w:pStyle w:val="ListParagraph"/>
+        <w:numPr>
+          <w:ilvl w:val="0"/>
+          <w:numId w:val="2"/>
+        </w:numPr>
+        <w:spacing w:after="60"/>
+      </w:pPr>
+      <w:r>
+        <w:t>Use cases appear inside the named system boundary.</w:t>
+      </w:r>
+    </w:p>
+    <w:p>
+      <w:pPr>
+        <w:pStyle w:val="ListParagraph"/>
+        <w:numPr>
+          <w:ilvl w:val="0"/>
+          <w:numId w:val="2"/>
+        </w:numPr>
+        <w:spacing w:after="60"/>
+      </w:pPr>
+      <w:r>
+        <w:t>The use-case names use verb–object wording.</w:t>
+      </w:r>
+    </w:p>
+    <w:p>
+      <w:pPr>
+        <w:pStyle w:val="ListParagraph"/>
+        <w:numPr>
+          <w:ilvl w:val="0"/>
+          <w:numId w:val="2"/>
+        </w:numPr>
+        <w:spacing w:after="60"/>
+      </w:pPr>
+      <w:r>
+        <w:t>Associations show participation rather than message order.</w:t>
+      </w:r>
+    </w:p>
+    <w:p>
+      <w:pPr>
+        <w:pStyle w:val="ListParagraph"/>
+        <w:numPr>
+          <w:ilvl w:val="0"/>
+          <w:numId w:val="2"/>
+        </w:numPr>
+        <w:spacing w:after="60"/>
+      </w:pPr>
+      <w:r>
+        <w:t>Each use case is linked to its primary actor from the catalogue (6.1), so not every actor is connected to every use case.</w:t>
+      </w:r>
+    </w:p>
+    <w:p>
+      <w:pPr>
+        <w:pStyle w:val="ListParagraph"/>
+        <w:numPr>
+          <w:ilvl w:val="0"/>
+          <w:numId w:val="2"/>
+        </w:numPr>
+        <w:spacing w:after="60"/>
+      </w:pPr>
+      <w:r>
+        <w:t>No supporting actor is drawn because the scenario does not mention an outside system that this system calls (Section 3.2).</w:t>
+      </w:r>
+    </w:p>
+    <w:p>
+      <w:pPr>
+        <w:pStyle w:val="ListParagraph"/>
+        <w:numPr>
+          <w:ilvl w:val="0"/>
+          <w:numId w:val="2"/>
+        </w:numPr>
+        <w:spacing w:after="60"/>
+      </w:pPr>
+      <w:r>
+        <w:t>Vessel operators, the safety officer, the insurer and the other offstage stakeholders are not drawn because they do not use the system directly (Section 3.2, A07).</w:t>
+      </w:r>
+    </w:p>
+    <w:p>
+      <w:pPr>
+        <w:pStyle w:val="ListParagraph"/>
+        <w:numPr>
+          <w:ilvl w:val="0"/>
+          <w:numId w:val="2"/>
+        </w:numPr>
+        <w:spacing w:after="60"/>
+      </w:pPr>
+      <w:r>
+        <w:t>No database, Java class, screen, field or controller appears in the diagram.</w:t>
+      </w:r>
+    </w:p>
+    <w:p>
+      <w:pPr>
+        <w:pStyle w:val="ListParagraph"/>
+        <w:numPr>
+          <w:ilvl w:val="0"/>
+          <w:numId w:val="2"/>
+        </w:numPr>
+        <w:spacing w:after="60"/>
+      </w:pPr>
+      <w:r>
+        <w:t>No include or extend relationship is needed at this stage.</w:t>
+      </w:r>
+    </w:p>
+    <w:p>
+      <w:pPr>
+        <w:keepNext/>
+        <w:spacing w:before="280" w:after="120"/>
+      </w:pPr>
+      <w:r>
+        <w:rPr>
+          <w:b/>
+          <w:bCs/>
+          <w:color w:val="404040"/>
+          <w:sz w:val="26"/>
+          <w:szCs w:val="26"/>
+        </w:rPr>
+        <w:t>6.3 Detailed use case: UC04 Allocate Berth</w:t>
+      </w:r>
+    </w:p>
+    <w:p>
+      <w:pPr>
+        <w:spacing w:after="140"/>
+      </w:pPr>
+      <w:r>
+        <w:rPr>
+          <w:i/>
+          <w:iCs/>
+          <w:color w:val="595959"/>
+          <w:sz w:val="19"/>
+          <w:szCs w:val="19"/>
+        </w:rPr>
+        <w:t>Based on: Session 7 lecture</w:t>
+      </w:r>
+    </w:p>
+    <w:p>
+      <w:pPr>
+        <w:keepNext/>
+        <w:spacing w:before="120" w:after="80"/>
+      </w:pPr>
+      <w:r>
+        <w:rPr>
+          <w:b/>
+          <w:bCs/>
+          <w:color w:val="404040"/>
           <w:sz w:val="22"/>
           <w:szCs w:val="22"/>
         </w:rPr>
-        <w:t>Every Must, Should and Could functional requirement (FR01–FR17 and FR22) and NFR01 appears in at least one use case. FR18–FR21 are Won’t items for this release, so they have no use case. The other non-functional requirements (NFR02–NFR06) describe qualities of the system, not actor goals, so they stay in the requirements catalogue (Section 4).</w:t>
+        <w:t>6.3.1 Header</w:t>
       </w:r>
     </w:p>
+    <w:tbl>
+      <w:tblPr>
+        <w:tblW w:w="15398" w:type="dxa"/>
+        <w:tblBorders>
+          <w:top w:val="single" w:sz="4" w:space="0" w:color="auto"/>
+          <w:left w:val="single" w:sz="4" w:space="0" w:color="auto"/>
+          <w:bottom w:val="single" w:sz="4" w:space="0" w:color="auto"/>
+          <w:right w:val="single" w:sz="4" w:space="0" w:color="auto"/>
+          <w:insideH w:val="single" w:sz="4" w:space="0" w:color="auto"/>
+          <w:insideV w:val="single" w:sz="4" w:space="0" w:color="auto"/>
+        </w:tblBorders>
+        <w:tblCellMar>
+          <w:left w:w="10" w:type="dxa"/>
+          <w:right w:w="10" w:type="dxa"/>
+        </w:tblCellMar>
+        <w:tblLook w:val="0000" w:firstRow="0" w:lastRow="0" w:firstColumn="0" w:lastColumn="0" w:noHBand="0" w:noVBand="0"/>
+      </w:tblPr>
+      <w:tblGrid>
+        <w:gridCol w:w="3400"/>
+        <w:gridCol w:w="11998"/>
+      </w:tblGrid>
+      <w:tr>
+        <w:tblPrEx>
+          <w:tblCellMar>
+            <w:top w:w="0" w:type="dxa"/>
+            <w:bottom w:w="0" w:type="dxa"/>
+          </w:tblCellMar>
+        </w:tblPrEx>
+        <w:trPr>
+          <w:tblHeader/>
+        </w:trPr>
+        <w:tc>
+          <w:tcPr>
+            <w:tcW w:w="3400" w:type="dxa"/>
+            <w:tcBorders>
+              <w:top w:val="single" w:sz="4" w:space="0" w:color="A6A6A6"/>
+              <w:left w:val="single" w:sz="4" w:space="0" w:color="A6A6A6"/>
+              <w:bottom w:val="single" w:sz="4" w:space="0" w:color="A6A6A6"/>
+              <w:right w:val="single" w:sz="4" w:space="0" w:color="A6A6A6"/>
+            </w:tcBorders>
+            <w:shd w:val="clear" w:color="auto" w:fill="D9D9D9"/>
+            <w:tcMar>
+              <w:top w:w="70" w:type="dxa"/>
+              <w:left w:w="110" w:type="dxa"/>
+              <w:bottom w:w="70" w:type="dxa"/>
+              <w:right w:w="110" w:type="dxa"/>
+            </w:tcMar>
+          </w:tcPr>
+          <w:p>
+            <w:pPr>
+              <w:spacing w:after="40"/>
+            </w:pPr>
+            <w:r>
+              <w:rPr>
+                <w:b/>
+                <w:bCs/>
+              </w:rPr>
+              <w:t>Field</w:t>
+            </w:r>
+          </w:p>
+        </w:tc>
+        <w:tc>
+          <w:tcPr>
+            <w:tcW w:w="11998" w:type="dxa"/>
+            <w:tcBorders>
+              <w:top w:val="single" w:sz="4" w:space="0" w:color="A6A6A6"/>
+              <w:left w:val="single" w:sz="4" w:space="0" w:color="A6A6A6"/>
+              <w:bottom w:val="single" w:sz="4" w:space="0" w:color="A6A6A6"/>
+              <w:right w:val="single" w:sz="4" w:space="0" w:color="A6A6A6"/>
+            </w:tcBorders>
+            <w:shd w:val="clear" w:color="auto" w:fill="D9D9D9"/>
+            <w:tcMar>
+              <w:top w:w="70" w:type="dxa"/>
+              <w:left w:w="110" w:type="dxa"/>
+              <w:bottom w:w="70" w:type="dxa"/>
+              <w:right w:w="110" w:type="dxa"/>
+            </w:tcMar>
+          </w:tcPr>
+          <w:p>
+            <w:pPr>
+              <w:spacing w:after="40"/>
+            </w:pPr>
+            <w:r>
+              <w:rPr>
+                <w:b/>
+                <w:bCs/>
+              </w:rPr>
+              <w:t>Content</w:t>
+            </w:r>
+          </w:p>
+        </w:tc>
+      </w:tr>
+      <w:tr>
+        <w:tblPrEx>
+          <w:tblCellMar>
+            <w:top w:w="0" w:type="dxa"/>
+            <w:bottom w:w="0" w:type="dxa"/>
+          </w:tblCellMar>
+        </w:tblPrEx>
+        <w:trPr>
+          <w:cantSplit/>
+        </w:trPr>
+        <w:tc>
+          <w:tcPr>
+            <w:tcW w:w="3400" w:type="dxa"/>
+            <w:tcBorders>
+              <w:top w:val="single" w:sz="4" w:space="0" w:color="A6A6A6"/>
+              <w:left w:val="single" w:sz="4" w:space="0" w:color="A6A6A6"/>
+              <w:bottom w:val="single" w:sz="4" w:space="0" w:color="A6A6A6"/>
+              <w:right w:val="single" w:sz="4" w:space="0" w:color="A6A6A6"/>
+            </w:tcBorders>
+            <w:tcMar>
+              <w:top w:w="70" w:type="dxa"/>
+              <w:left w:w="110" w:type="dxa"/>
+              <w:bottom w:w="70" w:type="dxa"/>
+              <w:right w:w="110" w:type="dxa"/>
+            </w:tcMar>
+          </w:tcPr>
+          <w:p>
+            <w:pPr>
+              <w:spacing w:after="40"/>
+            </w:pPr>
+            <w:r>
+              <w:t>ID and name</w:t>
+            </w:r>
+          </w:p>
+        </w:tc>
+        <w:tc>
+          <w:tcPr>
+            <w:tcW w:w="11998" w:type="dxa"/>
+            <w:tcBorders>
+              <w:top w:val="single" w:sz="4" w:space="0" w:color="A6A6A6"/>
+              <w:left w:val="single" w:sz="4" w:space="0" w:color="A6A6A6"/>
+              <w:bottom w:val="single" w:sz="4" w:space="0" w:color="A6A6A6"/>
+              <w:right w:val="single" w:sz="4" w:space="0" w:color="A6A6A6"/>
+            </w:tcBorders>
+            <w:tcMar>
+              <w:top w:w="70" w:type="dxa"/>
+              <w:left w:w="110" w:type="dxa"/>
+              <w:bottom w:w="70" w:type="dxa"/>
+              <w:right w:w="110" w:type="dxa"/>
+            </w:tcMar>
+          </w:tcPr>
+          <w:p>
+            <w:pPr>
+              <w:spacing w:after="40"/>
+            </w:pPr>
+            <w:r>
+              <w:t>UC04 Allocate Berth</w:t>
+            </w:r>
+          </w:p>
+        </w:tc>
+      </w:tr>
+      <w:tr>
+        <w:tblPrEx>
+          <w:tblCellMar>
+            <w:top w:w="0" w:type="dxa"/>
+            <w:bottom w:w="0" w:type="dxa"/>
+          </w:tblCellMar>
+        </w:tblPrEx>
+        <w:trPr>
+          <w:cantSplit/>
+        </w:trPr>
+        <w:tc>
+          <w:tcPr>
+            <w:tcW w:w="3400" w:type="dxa"/>
+            <w:tcBorders>
+              <w:top w:val="single" w:sz="4" w:space="0" w:color="A6A6A6"/>
+              <w:left w:val="single" w:sz="4" w:space="0" w:color="A6A6A6"/>
+              <w:bottom w:val="single" w:sz="4" w:space="0" w:color="A6A6A6"/>
+              <w:right w:val="single" w:sz="4" w:space="0" w:color="A6A6A6"/>
+            </w:tcBorders>
+            <w:tcMar>
+              <w:top w:w="70" w:type="dxa"/>
+              <w:left w:w="110" w:type="dxa"/>
+              <w:bottom w:w="70" w:type="dxa"/>
+              <w:right w:w="110" w:type="dxa"/>
+            </w:tcMar>
+          </w:tcPr>
+          <w:p>
+            <w:pPr>
+              <w:spacing w:after="40"/>
+            </w:pPr>
+            <w:r>
+              <w:t>Scope</w:t>
+            </w:r>
+          </w:p>
+        </w:tc>
+        <w:tc>
+          <w:tcPr>
+            <w:tcW w:w="11998" w:type="dxa"/>
+            <w:tcBorders>
+              <w:top w:val="single" w:sz="4" w:space="0" w:color="A6A6A6"/>
+              <w:left w:val="single" w:sz="4" w:space="0" w:color="A6A6A6"/>
+              <w:bottom w:val="single" w:sz="4" w:space="0" w:color="A6A6A6"/>
+              <w:right w:val="single" w:sz="4" w:space="0" w:color="A6A6A6"/>
+            </w:tcBorders>
+            <w:tcMar>
+              <w:top w:w="70" w:type="dxa"/>
+              <w:left w:w="110" w:type="dxa"/>
+              <w:bottom w:w="70" w:type="dxa"/>
+              <w:right w:w="110" w:type="dxa"/>
+            </w:tcMar>
+          </w:tcPr>
+          <w:p>
+            <w:pPr>
+              <w:spacing w:after="40"/>
+            </w:pPr>
+            <w:r>
+              <w:t>Harbour Equipment and Berth Service System</w:t>
+            </w:r>
+          </w:p>
+        </w:tc>
+      </w:tr>
+      <w:tr>
+        <w:tblPrEx>
+          <w:tblCellMar>
+            <w:top w:w="0" w:type="dxa"/>
+            <w:bottom w:w="0" w:type="dxa"/>
+          </w:tblCellMar>
+        </w:tblPrEx>
+        <w:trPr>
+          <w:cantSplit/>
+        </w:trPr>
+        <w:tc>
+          <w:tcPr>
+            <w:tcW w:w="3400" w:type="dxa"/>
+            <w:tcBorders>
+              <w:top w:val="single" w:sz="4" w:space="0" w:color="A6A6A6"/>
+              <w:left w:val="single" w:sz="4" w:space="0" w:color="A6A6A6"/>
+              <w:bottom w:val="single" w:sz="4" w:space="0" w:color="A6A6A6"/>
+              <w:right w:val="single" w:sz="4" w:space="0" w:color="A6A6A6"/>
+            </w:tcBorders>
+            <w:tcMar>
+              <w:top w:w="70" w:type="dxa"/>
+              <w:left w:w="110" w:type="dxa"/>
+              <w:bottom w:w="70" w:type="dxa"/>
+              <w:right w:w="110" w:type="dxa"/>
+            </w:tcMar>
+          </w:tcPr>
+          <w:p>
+            <w:pPr>
+              <w:spacing w:after="40"/>
+            </w:pPr>
+            <w:r>
+              <w:t>Level</w:t>
+            </w:r>
+          </w:p>
+        </w:tc>
+        <w:tc>
+          <w:tcPr>
+            <w:tcW w:w="11998" w:type="dxa"/>
+            <w:tcBorders>
+              <w:top w:val="single" w:sz="4" w:space="0" w:color="A6A6A6"/>
+              <w:left w:val="single" w:sz="4" w:space="0" w:color="A6A6A6"/>
+              <w:bottom w:val="single" w:sz="4" w:space="0" w:color="A6A6A6"/>
+              <w:right w:val="single" w:sz="4" w:space="0" w:color="A6A6A6"/>
+            </w:tcBorders>
+            <w:tcMar>
+              <w:top w:w="70" w:type="dxa"/>
+              <w:left w:w="110" w:type="dxa"/>
+              <w:bottom w:w="70" w:type="dxa"/>
+              <w:right w:w="110" w:type="dxa"/>
+            </w:tcMar>
+          </w:tcPr>
+          <w:p>
+            <w:pPr>
+              <w:spacing w:after="40"/>
+            </w:pPr>
+            <w:r>
+              <w:t>User goal</w:t>
+            </w:r>
+          </w:p>
+        </w:tc>
+      </w:tr>
+      <w:tr>
+        <w:tblPrEx>
+          <w:tblCellMar>
+            <w:top w:w="0" w:type="dxa"/>
+            <w:bottom w:w="0" w:type="dxa"/>
+          </w:tblCellMar>
+        </w:tblPrEx>
+        <w:trPr>
+          <w:cantSplit/>
+        </w:trPr>
+        <w:tc>
+          <w:tcPr>
+            <w:tcW w:w="3400" w:type="dxa"/>
+            <w:tcBorders>
+              <w:top w:val="single" w:sz="4" w:space="0" w:color="A6A6A6"/>
+              <w:left w:val="single" w:sz="4" w:space="0" w:color="A6A6A6"/>
+              <w:bottom w:val="single" w:sz="4" w:space="0" w:color="A6A6A6"/>
+              <w:right w:val="single" w:sz="4" w:space="0" w:color="A6A6A6"/>
+            </w:tcBorders>
+            <w:tcMar>
+              <w:top w:w="70" w:type="dxa"/>
+              <w:left w:w="110" w:type="dxa"/>
+              <w:bottom w:w="70" w:type="dxa"/>
+              <w:right w:w="110" w:type="dxa"/>
+            </w:tcMar>
+          </w:tcPr>
+          <w:p>
+            <w:pPr>
+              <w:spacing w:after="40"/>
+            </w:pPr>
+            <w:r>
+              <w:t>Primary actor</w:t>
+            </w:r>
+          </w:p>
+        </w:tc>
+        <w:tc>
+          <w:tcPr>
+            <w:tcW w:w="11998" w:type="dxa"/>
+            <w:tcBorders>
+              <w:top w:val="single" w:sz="4" w:space="0" w:color="A6A6A6"/>
+              <w:left w:val="single" w:sz="4" w:space="0" w:color="A6A6A6"/>
+              <w:bottom w:val="single" w:sz="4" w:space="0" w:color="A6A6A6"/>
+              <w:right w:val="single" w:sz="4" w:space="0" w:color="A6A6A6"/>
+            </w:tcBorders>
+            <w:tcMar>
+              <w:top w:w="70" w:type="dxa"/>
+              <w:left w:w="110" w:type="dxa"/>
+              <w:bottom w:w="70" w:type="dxa"/>
+              <w:right w:w="110" w:type="dxa"/>
+            </w:tcMar>
+          </w:tcPr>
+          <w:p>
+            <w:pPr>
+              <w:spacing w:after="40"/>
+            </w:pPr>
+            <w:r>
+              <w:t>Harbour coordinator</w:t>
+            </w:r>
+          </w:p>
+        </w:tc>
+      </w:tr>
+      <w:tr>
+        <w:tblPrEx>
+          <w:tblCellMar>
+            <w:top w:w="0" w:type="dxa"/>
+            <w:bottom w:w="0" w:type="dxa"/>
+          </w:tblCellMar>
+        </w:tblPrEx>
+        <w:trPr>
+          <w:cantSplit/>
+        </w:trPr>
+        <w:tc>
+          <w:tcPr>
+            <w:tcW w:w="3400" w:type="dxa"/>
+            <w:tcBorders>
+              <w:top w:val="single" w:sz="4" w:space="0" w:color="A6A6A6"/>
+              <w:left w:val="single" w:sz="4" w:space="0" w:color="A6A6A6"/>
+              <w:bottom w:val="single" w:sz="4" w:space="0" w:color="A6A6A6"/>
+              <w:right w:val="single" w:sz="4" w:space="0" w:color="A6A6A6"/>
+            </w:tcBorders>
+            <w:tcMar>
+              <w:top w:w="70" w:type="dxa"/>
+              <w:left w:w="110" w:type="dxa"/>
+              <w:bottom w:w="70" w:type="dxa"/>
+              <w:right w:w="110" w:type="dxa"/>
+            </w:tcMar>
+          </w:tcPr>
+          <w:p>
+            <w:pPr>
+              <w:spacing w:after="40"/>
+            </w:pPr>
+            <w:r>
+              <w:t>Preconditions</w:t>
+            </w:r>
+          </w:p>
+        </w:tc>
+        <w:tc>
+          <w:tcPr>
+            <w:tcW w:w="11998" w:type="dxa"/>
+            <w:tcBorders>
+              <w:top w:val="single" w:sz="4" w:space="0" w:color="A6A6A6"/>
+              <w:left w:val="single" w:sz="4" w:space="0" w:color="A6A6A6"/>
+              <w:bottom w:val="single" w:sz="4" w:space="0" w:color="A6A6A6"/>
+              <w:right w:val="single" w:sz="4" w:space="0" w:color="A6A6A6"/>
+            </w:tcBorders>
+            <w:tcMar>
+              <w:top w:w="70" w:type="dxa"/>
+              <w:left w:w="110" w:type="dxa"/>
+              <w:bottom w:w="70" w:type="dxa"/>
+              <w:right w:w="110" w:type="dxa"/>
+            </w:tcMar>
+          </w:tcPr>
+          <w:p>
+            <w:pPr>
+              <w:spacing w:after="40"/>
+            </w:pPr>
+            <w:r>
+              <w:t>The berth request is recorded with the vessel details, arrival and departure time and services needed (UC01). The length, depth, access and power of each berth are known to the system (assumption: the scenario does not say how berth details are kept).</w:t>
+            </w:r>
+          </w:p>
+        </w:tc>
+      </w:tr>
+      <w:tr>
+        <w:tblPrEx>
+          <w:tblCellMar>
+            <w:top w:w="0" w:type="dxa"/>
+            <w:bottom w:w="0" w:type="dxa"/>
+          </w:tblCellMar>
+        </w:tblPrEx>
+        <w:trPr>
+          <w:cantSplit/>
+        </w:trPr>
+        <w:tc>
+          <w:tcPr>
+            <w:tcW w:w="3400" w:type="dxa"/>
+            <w:tcBorders>
+              <w:top w:val="single" w:sz="4" w:space="0" w:color="A6A6A6"/>
+              <w:left w:val="single" w:sz="4" w:space="0" w:color="A6A6A6"/>
+              <w:bottom w:val="single" w:sz="4" w:space="0" w:color="A6A6A6"/>
+              <w:right w:val="single" w:sz="4" w:space="0" w:color="A6A6A6"/>
+            </w:tcBorders>
+            <w:tcMar>
+              <w:top w:w="70" w:type="dxa"/>
+              <w:left w:w="110" w:type="dxa"/>
+              <w:bottom w:w="70" w:type="dxa"/>
+              <w:right w:w="110" w:type="dxa"/>
+            </w:tcMar>
+          </w:tcPr>
+          <w:p>
+            <w:pPr>
+              <w:spacing w:after="40"/>
+            </w:pPr>
+            <w:r>
+              <w:t>Trigger</w:t>
+            </w:r>
+          </w:p>
+        </w:tc>
+        <w:tc>
+          <w:tcPr>
+            <w:tcW w:w="11998" w:type="dxa"/>
+            <w:tcBorders>
+              <w:top w:val="single" w:sz="4" w:space="0" w:color="A6A6A6"/>
+              <w:left w:val="single" w:sz="4" w:space="0" w:color="A6A6A6"/>
+              <w:bottom w:val="single" w:sz="4" w:space="0" w:color="A6A6A6"/>
+              <w:right w:val="single" w:sz="4" w:space="0" w:color="A6A6A6"/>
+            </w:tcBorders>
+            <w:tcMar>
+              <w:top w:w="70" w:type="dxa"/>
+              <w:left w:w="110" w:type="dxa"/>
+              <w:bottom w:w="70" w:type="dxa"/>
+              <w:right w:w="110" w:type="dxa"/>
+            </w:tcMar>
+          </w:tcPr>
+          <w:p>
+            <w:pPr>
+              <w:spacing w:after="40"/>
+            </w:pPr>
+            <w:r>
+              <w:t>The coordinator decides to give a berth to a recorded berth request.</w:t>
+            </w:r>
+          </w:p>
+        </w:tc>
+      </w:tr>
+      <w:tr>
+        <w:tblPrEx>
+          <w:tblCellMar>
+            <w:top w:w="0" w:type="dxa"/>
+            <w:bottom w:w="0" w:type="dxa"/>
+          </w:tblCellMar>
+        </w:tblPrEx>
+        <w:trPr>
+          <w:cantSplit/>
+        </w:trPr>
+        <w:tc>
+          <w:tcPr>
+            <w:tcW w:w="3400" w:type="dxa"/>
+            <w:tcBorders>
+              <w:top w:val="single" w:sz="4" w:space="0" w:color="A6A6A6"/>
+              <w:left w:val="single" w:sz="4" w:space="0" w:color="A6A6A6"/>
+              <w:bottom w:val="single" w:sz="4" w:space="0" w:color="A6A6A6"/>
+              <w:right w:val="single" w:sz="4" w:space="0" w:color="A6A6A6"/>
+            </w:tcBorders>
+            <w:tcMar>
+              <w:top w:w="70" w:type="dxa"/>
+              <w:left w:w="110" w:type="dxa"/>
+              <w:bottom w:w="70" w:type="dxa"/>
+              <w:right w:w="110" w:type="dxa"/>
+            </w:tcMar>
+          </w:tcPr>
+          <w:p>
+            <w:pPr>
+              <w:spacing w:after="40"/>
+            </w:pPr>
+            <w:r>
+              <w:t>Minimal guarantee</w:t>
+            </w:r>
+          </w:p>
+        </w:tc>
+        <w:tc>
+          <w:tcPr>
+            <w:tcW w:w="11998" w:type="dxa"/>
+            <w:tcBorders>
+              <w:top w:val="single" w:sz="4" w:space="0" w:color="A6A6A6"/>
+              <w:left w:val="single" w:sz="4" w:space="0" w:color="A6A6A6"/>
+              <w:bottom w:val="single" w:sz="4" w:space="0" w:color="A6A6A6"/>
+              <w:right w:val="single" w:sz="4" w:space="0" w:color="A6A6A6"/>
+            </w:tcBorders>
+            <w:tcMar>
+              <w:top w:w="70" w:type="dxa"/>
+              <w:left w:w="110" w:type="dxa"/>
+              <w:bottom w:w="70" w:type="dxa"/>
+              <w:right w:w="110" w:type="dxa"/>
+            </w:tcMar>
+          </w:tcPr>
+          <w:p>
+            <w:pPr>
+              <w:spacing w:after="40"/>
+            </w:pPr>
+            <w:r>
+              <w:t>No unsuitable berth is allocated, and no berth is allocated twice for the same time. When the goal cannot be completed, the reason is shown.</w:t>
+            </w:r>
+          </w:p>
+        </w:tc>
+      </w:tr>
+      <w:tr>
+        <w:tblPrEx>
+          <w:tblCellMar>
+            <w:top w:w="0" w:type="dxa"/>
+            <w:bottom w:w="0" w:type="dxa"/>
+          </w:tblCellMar>
+        </w:tblPrEx>
+        <w:trPr>
+          <w:cantSplit/>
+        </w:trPr>
+        <w:tc>
+          <w:tcPr>
+            <w:tcW w:w="3400" w:type="dxa"/>
+            <w:tcBorders>
+              <w:top w:val="single" w:sz="4" w:space="0" w:color="A6A6A6"/>
+              <w:left w:val="single" w:sz="4" w:space="0" w:color="A6A6A6"/>
+              <w:bottom w:val="single" w:sz="4" w:space="0" w:color="A6A6A6"/>
+              <w:right w:val="single" w:sz="4" w:space="0" w:color="A6A6A6"/>
+            </w:tcBorders>
+            <w:tcMar>
+              <w:top w:w="70" w:type="dxa"/>
+              <w:left w:w="110" w:type="dxa"/>
+              <w:bottom w:w="70" w:type="dxa"/>
+              <w:right w:w="110" w:type="dxa"/>
+            </w:tcMar>
+          </w:tcPr>
+          <w:p>
+            <w:pPr>
+              <w:spacing w:after="40"/>
+            </w:pPr>
+            <w:r>
+              <w:t>Success guarantee</w:t>
+            </w:r>
+          </w:p>
+        </w:tc>
+        <w:tc>
+          <w:tcPr>
+            <w:tcW w:w="11998" w:type="dxa"/>
+            <w:tcBorders>
+              <w:top w:val="single" w:sz="4" w:space="0" w:color="A6A6A6"/>
+              <w:left w:val="single" w:sz="4" w:space="0" w:color="A6A6A6"/>
+              <w:bottom w:val="single" w:sz="4" w:space="0" w:color="A6A6A6"/>
+              <w:right w:val="single" w:sz="4" w:space="0" w:color="A6A6A6"/>
+            </w:tcBorders>
+            <w:tcMar>
+              <w:top w:w="70" w:type="dxa"/>
+              <w:left w:w="110" w:type="dxa"/>
+              <w:bottom w:w="70" w:type="dxa"/>
+              <w:right w:w="110" w:type="dxa"/>
+            </w:tcMar>
+          </w:tcPr>
+          <w:p>
+            <w:pPr>
+              <w:spacing w:after="40"/>
+            </w:pPr>
+            <w:r>
+              <w:t>The request has one suitable berth for its arrival and departure time, and the berth is shown as allocated for that time.</w:t>
+            </w:r>
+          </w:p>
+        </w:tc>
+      </w:tr>
+      <w:tr>
+        <w:tblPrEx>
+          <w:tblCellMar>
+            <w:top w:w="0" w:type="dxa"/>
+            <w:bottom w:w="0" w:type="dxa"/>
+          </w:tblCellMar>
+        </w:tblPrEx>
+        <w:trPr>
+          <w:cantSplit/>
+        </w:trPr>
+        <w:tc>
+          <w:tcPr>
+            <w:tcW w:w="3400" w:type="dxa"/>
+            <w:tcBorders>
+              <w:top w:val="single" w:sz="4" w:space="0" w:color="A6A6A6"/>
+              <w:left w:val="single" w:sz="4" w:space="0" w:color="A6A6A6"/>
+              <w:bottom w:val="single" w:sz="4" w:space="0" w:color="A6A6A6"/>
+              <w:right w:val="single" w:sz="4" w:space="0" w:color="A6A6A6"/>
+            </w:tcBorders>
+            <w:tcMar>
+              <w:top w:w="70" w:type="dxa"/>
+              <w:left w:w="110" w:type="dxa"/>
+              <w:bottom w:w="70" w:type="dxa"/>
+              <w:right w:w="110" w:type="dxa"/>
+            </w:tcMar>
+          </w:tcPr>
+          <w:p>
+            <w:pPr>
+              <w:spacing w:after="40"/>
+            </w:pPr>
+            <w:r>
+              <w:t>Open issue</w:t>
+            </w:r>
+          </w:p>
+        </w:tc>
+        <w:tc>
+          <w:tcPr>
+            <w:tcW w:w="11998" w:type="dxa"/>
+            <w:tcBorders>
+              <w:top w:val="single" w:sz="4" w:space="0" w:color="A6A6A6"/>
+              <w:left w:val="single" w:sz="4" w:space="0" w:color="A6A6A6"/>
+              <w:bottom w:val="single" w:sz="4" w:space="0" w:color="A6A6A6"/>
+              <w:right w:val="single" w:sz="4" w:space="0" w:color="A6A6A6"/>
+            </w:tcBorders>
+            <w:tcMar>
+              <w:top w:w="70" w:type="dxa"/>
+              <w:left w:w="110" w:type="dxa"/>
+              <w:bottom w:w="70" w:type="dxa"/>
+              <w:right w:w="110" w:type="dxa"/>
+            </w:tcMar>
+          </w:tcPr>
+          <w:p>
+            <w:pPr>
+              <w:spacing w:after="40"/>
+            </w:pPr>
+            <w:r>
+              <w:t>The exact suitability rule is not agreed (Q03). How a temporary berth is given to an early arrival is not established (Q12). That a provisional hold blocks the berth is an assumption (A01). If the request is still provisional, the berth is shown as held rather than allocated (FR03, UC03).</w:t>
+            </w:r>
+          </w:p>
+        </w:tc>
+      </w:tr>
+    </w:tbl>
+    <w:p>
+      <w:pPr>
+        <w:keepNext/>
+        <w:spacing w:before="200" w:after="80"/>
+      </w:pPr>
+      <w:r>
+        <w:rPr>
+          <w:b/>
+          <w:bCs/>
+          <w:color w:val="404040"/>
+          <w:sz w:val="22"/>
+          <w:szCs w:val="22"/>
+        </w:rPr>
+        <w:lastRenderedPageBreak/>
+        <w:t>6.3.2 Main Success Scenario</w:t>
+      </w:r>
+    </w:p>
+    <w:tbl>
+      <w:tblPr>
+        <w:tblW w:w="15398" w:type="dxa"/>
+        <w:tblBorders>
+          <w:top w:val="single" w:sz="4" w:space="0" w:color="auto"/>
+          <w:left w:val="single" w:sz="4" w:space="0" w:color="auto"/>
+          <w:bottom w:val="single" w:sz="4" w:space="0" w:color="auto"/>
+          <w:right w:val="single" w:sz="4" w:space="0" w:color="auto"/>
+          <w:insideH w:val="single" w:sz="4" w:space="0" w:color="auto"/>
+          <w:insideV w:val="single" w:sz="4" w:space="0" w:color="auto"/>
+        </w:tblBorders>
+        <w:tblCellMar>
+          <w:left w:w="10" w:type="dxa"/>
+          <w:right w:w="10" w:type="dxa"/>
+        </w:tblCellMar>
+        <w:tblLook w:val="0000" w:firstRow="0" w:lastRow="0" w:firstColumn="0" w:lastColumn="0" w:noHBand="0" w:noVBand="0"/>
+      </w:tblPr>
+      <w:tblGrid>
+        <w:gridCol w:w="1000"/>
+        <w:gridCol w:w="14398"/>
+      </w:tblGrid>
+      <w:tr>
+        <w:tblPrEx>
+          <w:tblCellMar>
+            <w:top w:w="0" w:type="dxa"/>
+            <w:bottom w:w="0" w:type="dxa"/>
+          </w:tblCellMar>
+        </w:tblPrEx>
+        <w:trPr>
+          <w:tblHeader/>
+        </w:trPr>
+        <w:tc>
+          <w:tcPr>
+            <w:tcW w:w="1000" w:type="dxa"/>
+            <w:tcBorders>
+              <w:top w:val="single" w:sz="4" w:space="0" w:color="A6A6A6"/>
+              <w:left w:val="single" w:sz="4" w:space="0" w:color="A6A6A6"/>
+              <w:bottom w:val="single" w:sz="4" w:space="0" w:color="A6A6A6"/>
+              <w:right w:val="single" w:sz="4" w:space="0" w:color="A6A6A6"/>
+            </w:tcBorders>
+            <w:shd w:val="clear" w:color="auto" w:fill="D9D9D9"/>
+            <w:tcMar>
+              <w:top w:w="70" w:type="dxa"/>
+              <w:left w:w="110" w:type="dxa"/>
+              <w:bottom w:w="70" w:type="dxa"/>
+              <w:right w:w="110" w:type="dxa"/>
+            </w:tcMar>
+          </w:tcPr>
+          <w:p>
+            <w:pPr>
+              <w:spacing w:after="40"/>
+            </w:pPr>
+            <w:r>
+              <w:rPr>
+                <w:b/>
+                <w:bCs/>
+              </w:rPr>
+              <w:t>Step</w:t>
+            </w:r>
+          </w:p>
+        </w:tc>
+        <w:tc>
+          <w:tcPr>
+            <w:tcW w:w="14398" w:type="dxa"/>
+            <w:tcBorders>
+              <w:top w:val="single" w:sz="4" w:space="0" w:color="A6A6A6"/>
+              <w:left w:val="single" w:sz="4" w:space="0" w:color="A6A6A6"/>
+              <w:bottom w:val="single" w:sz="4" w:space="0" w:color="A6A6A6"/>
+              <w:right w:val="single" w:sz="4" w:space="0" w:color="A6A6A6"/>
+            </w:tcBorders>
+            <w:shd w:val="clear" w:color="auto" w:fill="D9D9D9"/>
+            <w:tcMar>
+              <w:top w:w="70" w:type="dxa"/>
+              <w:left w:w="110" w:type="dxa"/>
+              <w:bottom w:w="70" w:type="dxa"/>
+              <w:right w:w="110" w:type="dxa"/>
+            </w:tcMar>
+          </w:tcPr>
+          <w:p>
+            <w:pPr>
+              <w:spacing w:after="40"/>
+            </w:pPr>
+            <w:r>
+              <w:rPr>
+                <w:b/>
+                <w:bCs/>
+              </w:rPr>
+              <w:t>Actor intention or system responsibility</w:t>
+            </w:r>
+          </w:p>
+        </w:tc>
+      </w:tr>
+      <w:tr>
+        <w:tblPrEx>
+          <w:tblCellMar>
+            <w:top w:w="0" w:type="dxa"/>
+            <w:bottom w:w="0" w:type="dxa"/>
+          </w:tblCellMar>
+        </w:tblPrEx>
+        <w:trPr>
+          <w:cantSplit/>
+        </w:trPr>
+        <w:tc>
+          <w:tcPr>
+            <w:tcW w:w="1000" w:type="dxa"/>
+            <w:tcBorders>
+              <w:top w:val="single" w:sz="4" w:space="0" w:color="A6A6A6"/>
+              <w:left w:val="single" w:sz="4" w:space="0" w:color="A6A6A6"/>
+              <w:bottom w:val="single" w:sz="4" w:space="0" w:color="A6A6A6"/>
+              <w:right w:val="single" w:sz="4" w:space="0" w:color="A6A6A6"/>
+            </w:tcBorders>
+            <w:tcMar>
+              <w:top w:w="70" w:type="dxa"/>
+              <w:left w:w="110" w:type="dxa"/>
+              <w:bottom w:w="70" w:type="dxa"/>
+              <w:right w:w="110" w:type="dxa"/>
+            </w:tcMar>
+          </w:tcPr>
+          <w:p>
+            <w:pPr>
+              <w:spacing w:after="40"/>
+            </w:pPr>
+            <w:r>
+              <w:t>1</w:t>
+            </w:r>
+          </w:p>
+        </w:tc>
+        <w:tc>
+          <w:tcPr>
+            <w:tcW w:w="14398" w:type="dxa"/>
+            <w:tcBorders>
+              <w:top w:val="single" w:sz="4" w:space="0" w:color="A6A6A6"/>
+              <w:left w:val="single" w:sz="4" w:space="0" w:color="A6A6A6"/>
+              <w:bottom w:val="single" w:sz="4" w:space="0" w:color="A6A6A6"/>
+              <w:right w:val="single" w:sz="4" w:space="0" w:color="A6A6A6"/>
+            </w:tcBorders>
+            <w:tcMar>
+              <w:top w:w="70" w:type="dxa"/>
+              <w:left w:w="110" w:type="dxa"/>
+              <w:bottom w:w="70" w:type="dxa"/>
+              <w:right w:w="110" w:type="dxa"/>
+            </w:tcMar>
+          </w:tcPr>
+          <w:p>
+            <w:pPr>
+              <w:spacing w:after="40"/>
+            </w:pPr>
+            <w:r>
+              <w:t>The coordinator selects the berth request to be allocated.</w:t>
+            </w:r>
+          </w:p>
+        </w:tc>
+      </w:tr>
+      <w:tr>
+        <w:tblPrEx>
+          <w:tblCellMar>
+            <w:top w:w="0" w:type="dxa"/>
+            <w:bottom w:w="0" w:type="dxa"/>
+          </w:tblCellMar>
+        </w:tblPrEx>
+        <w:trPr>
+          <w:cantSplit/>
+        </w:trPr>
+        <w:tc>
+          <w:tcPr>
+            <w:tcW w:w="1000" w:type="dxa"/>
+            <w:tcBorders>
+              <w:top w:val="single" w:sz="4" w:space="0" w:color="A6A6A6"/>
+              <w:left w:val="single" w:sz="4" w:space="0" w:color="A6A6A6"/>
+              <w:bottom w:val="single" w:sz="4" w:space="0" w:color="A6A6A6"/>
+              <w:right w:val="single" w:sz="4" w:space="0" w:color="A6A6A6"/>
+            </w:tcBorders>
+            <w:tcMar>
+              <w:top w:w="70" w:type="dxa"/>
+              <w:left w:w="110" w:type="dxa"/>
+              <w:bottom w:w="70" w:type="dxa"/>
+              <w:right w:w="110" w:type="dxa"/>
+            </w:tcMar>
+          </w:tcPr>
+          <w:p>
+            <w:pPr>
+              <w:spacing w:after="40"/>
+            </w:pPr>
+            <w:r>
+              <w:t>2</w:t>
+            </w:r>
+          </w:p>
+        </w:tc>
+        <w:tc>
+          <w:tcPr>
+            <w:tcW w:w="14398" w:type="dxa"/>
+            <w:tcBorders>
+              <w:top w:val="single" w:sz="4" w:space="0" w:color="A6A6A6"/>
+              <w:left w:val="single" w:sz="4" w:space="0" w:color="A6A6A6"/>
+              <w:bottom w:val="single" w:sz="4" w:space="0" w:color="A6A6A6"/>
+              <w:right w:val="single" w:sz="4" w:space="0" w:color="A6A6A6"/>
+            </w:tcBorders>
+            <w:tcMar>
+              <w:top w:w="70" w:type="dxa"/>
+              <w:left w:w="110" w:type="dxa"/>
+              <w:bottom w:w="70" w:type="dxa"/>
+              <w:right w:w="110" w:type="dxa"/>
+            </w:tcMar>
+          </w:tcPr>
+          <w:p>
+            <w:pPr>
+              <w:spacing w:after="40"/>
+            </w:pPr>
+            <w:r>
+              <w:t>The system shows the vessel details, the arrival and departure time and the services needed.</w:t>
+            </w:r>
+          </w:p>
+        </w:tc>
+      </w:tr>
+      <w:tr>
+        <w:tblPrEx>
+          <w:tblCellMar>
+            <w:top w:w="0" w:type="dxa"/>
+            <w:bottom w:w="0" w:type="dxa"/>
+          </w:tblCellMar>
+        </w:tblPrEx>
+        <w:trPr>
+          <w:cantSplit/>
+        </w:trPr>
+        <w:tc>
+          <w:tcPr>
+            <w:tcW w:w="1000" w:type="dxa"/>
+            <w:tcBorders>
+              <w:top w:val="single" w:sz="4" w:space="0" w:color="A6A6A6"/>
+              <w:left w:val="single" w:sz="4" w:space="0" w:color="A6A6A6"/>
+              <w:bottom w:val="single" w:sz="4" w:space="0" w:color="A6A6A6"/>
+              <w:right w:val="single" w:sz="4" w:space="0" w:color="A6A6A6"/>
+            </w:tcBorders>
+            <w:tcMar>
+              <w:top w:w="70" w:type="dxa"/>
+              <w:left w:w="110" w:type="dxa"/>
+              <w:bottom w:w="70" w:type="dxa"/>
+              <w:right w:w="110" w:type="dxa"/>
+            </w:tcMar>
+          </w:tcPr>
+          <w:p>
+            <w:pPr>
+              <w:spacing w:after="40"/>
+            </w:pPr>
+            <w:r>
+              <w:t>3</w:t>
+            </w:r>
+          </w:p>
+        </w:tc>
+        <w:tc>
+          <w:tcPr>
+            <w:tcW w:w="14398" w:type="dxa"/>
+            <w:tcBorders>
+              <w:top w:val="single" w:sz="4" w:space="0" w:color="A6A6A6"/>
+              <w:left w:val="single" w:sz="4" w:space="0" w:color="A6A6A6"/>
+              <w:bottom w:val="single" w:sz="4" w:space="0" w:color="A6A6A6"/>
+              <w:right w:val="single" w:sz="4" w:space="0" w:color="A6A6A6"/>
+            </w:tcBorders>
+            <w:tcMar>
+              <w:top w:w="70" w:type="dxa"/>
+              <w:left w:w="110" w:type="dxa"/>
+              <w:bottom w:w="70" w:type="dxa"/>
+              <w:right w:w="110" w:type="dxa"/>
+            </w:tcMar>
+          </w:tcPr>
+          <w:p>
+            <w:pPr>
+              <w:spacing w:after="40"/>
+            </w:pPr>
+            <w:r>
+              <w:t>The system finds the berths that fit the vessel's length and depth, have suitable access and offer the services needed, such as power.</w:t>
+            </w:r>
+          </w:p>
+        </w:tc>
+      </w:tr>
+      <w:tr>
+        <w:tblPrEx>
+          <w:tblCellMar>
+            <w:top w:w="0" w:type="dxa"/>
+            <w:bottom w:w="0" w:type="dxa"/>
+          </w:tblCellMar>
+        </w:tblPrEx>
+        <w:trPr>
+          <w:cantSplit/>
+        </w:trPr>
+        <w:tc>
+          <w:tcPr>
+            <w:tcW w:w="1000" w:type="dxa"/>
+            <w:tcBorders>
+              <w:top w:val="single" w:sz="4" w:space="0" w:color="A6A6A6"/>
+              <w:left w:val="single" w:sz="4" w:space="0" w:color="A6A6A6"/>
+              <w:bottom w:val="single" w:sz="4" w:space="0" w:color="A6A6A6"/>
+              <w:right w:val="single" w:sz="4" w:space="0" w:color="A6A6A6"/>
+            </w:tcBorders>
+            <w:tcMar>
+              <w:top w:w="70" w:type="dxa"/>
+              <w:left w:w="110" w:type="dxa"/>
+              <w:bottom w:w="70" w:type="dxa"/>
+              <w:right w:w="110" w:type="dxa"/>
+            </w:tcMar>
+          </w:tcPr>
+          <w:p>
+            <w:pPr>
+              <w:spacing w:after="40"/>
+            </w:pPr>
+            <w:r>
+              <w:t>4</w:t>
+            </w:r>
+          </w:p>
+        </w:tc>
+        <w:tc>
+          <w:tcPr>
+            <w:tcW w:w="14398" w:type="dxa"/>
+            <w:tcBorders>
+              <w:top w:val="single" w:sz="4" w:space="0" w:color="A6A6A6"/>
+              <w:left w:val="single" w:sz="4" w:space="0" w:color="A6A6A6"/>
+              <w:bottom w:val="single" w:sz="4" w:space="0" w:color="A6A6A6"/>
+              <w:right w:val="single" w:sz="4" w:space="0" w:color="A6A6A6"/>
+            </w:tcBorders>
+            <w:tcMar>
+              <w:top w:w="70" w:type="dxa"/>
+              <w:left w:w="110" w:type="dxa"/>
+              <w:bottom w:w="70" w:type="dxa"/>
+              <w:right w:w="110" w:type="dxa"/>
+            </w:tcMar>
+          </w:tcPr>
+          <w:p>
+            <w:pPr>
+              <w:spacing w:after="40"/>
+            </w:pPr>
+            <w:r>
+              <w:t>The system confirms that these berths are not allocated or held for any part of the requested time.</w:t>
+            </w:r>
+          </w:p>
+        </w:tc>
+      </w:tr>
+      <w:tr>
+        <w:tblPrEx>
+          <w:tblCellMar>
+            <w:top w:w="0" w:type="dxa"/>
+            <w:bottom w:w="0" w:type="dxa"/>
+          </w:tblCellMar>
+        </w:tblPrEx>
+        <w:trPr>
+          <w:cantSplit/>
+        </w:trPr>
+        <w:tc>
+          <w:tcPr>
+            <w:tcW w:w="1000" w:type="dxa"/>
+            <w:tcBorders>
+              <w:top w:val="single" w:sz="4" w:space="0" w:color="A6A6A6"/>
+              <w:left w:val="single" w:sz="4" w:space="0" w:color="A6A6A6"/>
+              <w:bottom w:val="single" w:sz="4" w:space="0" w:color="A6A6A6"/>
+              <w:right w:val="single" w:sz="4" w:space="0" w:color="A6A6A6"/>
+            </w:tcBorders>
+            <w:tcMar>
+              <w:top w:w="70" w:type="dxa"/>
+              <w:left w:w="110" w:type="dxa"/>
+              <w:bottom w:w="70" w:type="dxa"/>
+              <w:right w:w="110" w:type="dxa"/>
+            </w:tcMar>
+          </w:tcPr>
+          <w:p>
+            <w:pPr>
+              <w:spacing w:after="40"/>
+            </w:pPr>
+            <w:r>
+              <w:t>5</w:t>
+            </w:r>
+          </w:p>
+        </w:tc>
+        <w:tc>
+          <w:tcPr>
+            <w:tcW w:w="14398" w:type="dxa"/>
+            <w:tcBorders>
+              <w:top w:val="single" w:sz="4" w:space="0" w:color="A6A6A6"/>
+              <w:left w:val="single" w:sz="4" w:space="0" w:color="A6A6A6"/>
+              <w:bottom w:val="single" w:sz="4" w:space="0" w:color="A6A6A6"/>
+              <w:right w:val="single" w:sz="4" w:space="0" w:color="A6A6A6"/>
+            </w:tcBorders>
+            <w:tcMar>
+              <w:top w:w="70" w:type="dxa"/>
+              <w:left w:w="110" w:type="dxa"/>
+              <w:bottom w:w="70" w:type="dxa"/>
+              <w:right w:w="110" w:type="dxa"/>
+            </w:tcMar>
+          </w:tcPr>
+          <w:p>
+            <w:pPr>
+              <w:spacing w:after="40"/>
+            </w:pPr>
+            <w:r>
+              <w:t>The system confirms that no harbour notice, restriction or works affects these berths at that time.</w:t>
+            </w:r>
+          </w:p>
+        </w:tc>
+      </w:tr>
+      <w:tr>
+        <w:tblPrEx>
+          <w:tblCellMar>
+            <w:top w:w="0" w:type="dxa"/>
+            <w:bottom w:w="0" w:type="dxa"/>
+          </w:tblCellMar>
+        </w:tblPrEx>
+        <w:trPr>
+          <w:cantSplit/>
+        </w:trPr>
+        <w:tc>
+          <w:tcPr>
+            <w:tcW w:w="1000" w:type="dxa"/>
+            <w:tcBorders>
+              <w:top w:val="single" w:sz="4" w:space="0" w:color="A6A6A6"/>
+              <w:left w:val="single" w:sz="4" w:space="0" w:color="A6A6A6"/>
+              <w:bottom w:val="single" w:sz="4" w:space="0" w:color="A6A6A6"/>
+              <w:right w:val="single" w:sz="4" w:space="0" w:color="A6A6A6"/>
+            </w:tcBorders>
+            <w:tcMar>
+              <w:top w:w="70" w:type="dxa"/>
+              <w:left w:w="110" w:type="dxa"/>
+              <w:bottom w:w="70" w:type="dxa"/>
+              <w:right w:w="110" w:type="dxa"/>
+            </w:tcMar>
+          </w:tcPr>
+          <w:p>
+            <w:pPr>
+              <w:spacing w:after="40"/>
+            </w:pPr>
+            <w:r>
+              <w:t>6</w:t>
+            </w:r>
+          </w:p>
+        </w:tc>
+        <w:tc>
+          <w:tcPr>
+            <w:tcW w:w="14398" w:type="dxa"/>
+            <w:tcBorders>
+              <w:top w:val="single" w:sz="4" w:space="0" w:color="A6A6A6"/>
+              <w:left w:val="single" w:sz="4" w:space="0" w:color="A6A6A6"/>
+              <w:bottom w:val="single" w:sz="4" w:space="0" w:color="A6A6A6"/>
+              <w:right w:val="single" w:sz="4" w:space="0" w:color="A6A6A6"/>
+            </w:tcBorders>
+            <w:tcMar>
+              <w:top w:w="70" w:type="dxa"/>
+              <w:left w:w="110" w:type="dxa"/>
+              <w:bottom w:w="70" w:type="dxa"/>
+              <w:right w:w="110" w:type="dxa"/>
+            </w:tcMar>
+          </w:tcPr>
+          <w:p>
+            <w:pPr>
+              <w:spacing w:after="40"/>
+            </w:pPr>
+            <w:r>
+              <w:t>The system shows the suitable and free berths.</w:t>
+            </w:r>
+          </w:p>
+        </w:tc>
+      </w:tr>
+      <w:tr>
+        <w:tblPrEx>
+          <w:tblCellMar>
+            <w:top w:w="0" w:type="dxa"/>
+            <w:bottom w:w="0" w:type="dxa"/>
+          </w:tblCellMar>
+        </w:tblPrEx>
+        <w:trPr>
+          <w:cantSplit/>
+        </w:trPr>
+        <w:tc>
+          <w:tcPr>
+            <w:tcW w:w="1000" w:type="dxa"/>
+            <w:tcBorders>
+              <w:top w:val="single" w:sz="4" w:space="0" w:color="A6A6A6"/>
+              <w:left w:val="single" w:sz="4" w:space="0" w:color="A6A6A6"/>
+              <w:bottom w:val="single" w:sz="4" w:space="0" w:color="A6A6A6"/>
+              <w:right w:val="single" w:sz="4" w:space="0" w:color="A6A6A6"/>
+            </w:tcBorders>
+            <w:tcMar>
+              <w:top w:w="70" w:type="dxa"/>
+              <w:left w:w="110" w:type="dxa"/>
+              <w:bottom w:w="70" w:type="dxa"/>
+              <w:right w:w="110" w:type="dxa"/>
+            </w:tcMar>
+          </w:tcPr>
+          <w:p>
+            <w:pPr>
+              <w:spacing w:after="40"/>
+            </w:pPr>
+            <w:r>
+              <w:t>7</w:t>
+            </w:r>
+          </w:p>
+        </w:tc>
+        <w:tc>
+          <w:tcPr>
+            <w:tcW w:w="14398" w:type="dxa"/>
+            <w:tcBorders>
+              <w:top w:val="single" w:sz="4" w:space="0" w:color="A6A6A6"/>
+              <w:left w:val="single" w:sz="4" w:space="0" w:color="A6A6A6"/>
+              <w:bottom w:val="single" w:sz="4" w:space="0" w:color="A6A6A6"/>
+              <w:right w:val="single" w:sz="4" w:space="0" w:color="A6A6A6"/>
+            </w:tcBorders>
+            <w:tcMar>
+              <w:top w:w="70" w:type="dxa"/>
+              <w:left w:w="110" w:type="dxa"/>
+              <w:bottom w:w="70" w:type="dxa"/>
+              <w:right w:w="110" w:type="dxa"/>
+            </w:tcMar>
+          </w:tcPr>
+          <w:p>
+            <w:pPr>
+              <w:spacing w:after="40"/>
+            </w:pPr>
+            <w:r>
+              <w:t>The coordinator chooses one berth.</w:t>
+            </w:r>
+          </w:p>
+        </w:tc>
+      </w:tr>
+      <w:tr>
+        <w:tblPrEx>
+          <w:tblCellMar>
+            <w:top w:w="0" w:type="dxa"/>
+            <w:bottom w:w="0" w:type="dxa"/>
+          </w:tblCellMar>
+        </w:tblPrEx>
+        <w:trPr>
+          <w:cantSplit/>
+        </w:trPr>
+        <w:tc>
+          <w:tcPr>
+            <w:tcW w:w="1000" w:type="dxa"/>
+            <w:tcBorders>
+              <w:top w:val="single" w:sz="4" w:space="0" w:color="A6A6A6"/>
+              <w:left w:val="single" w:sz="4" w:space="0" w:color="A6A6A6"/>
+              <w:bottom w:val="single" w:sz="4" w:space="0" w:color="A6A6A6"/>
+              <w:right w:val="single" w:sz="4" w:space="0" w:color="A6A6A6"/>
+            </w:tcBorders>
+            <w:tcMar>
+              <w:top w:w="70" w:type="dxa"/>
+              <w:left w:w="110" w:type="dxa"/>
+              <w:bottom w:w="70" w:type="dxa"/>
+              <w:right w:w="110" w:type="dxa"/>
+            </w:tcMar>
+          </w:tcPr>
+          <w:p>
+            <w:pPr>
+              <w:spacing w:after="40"/>
+            </w:pPr>
+            <w:r>
+              <w:t>8</w:t>
+            </w:r>
+          </w:p>
+        </w:tc>
+        <w:tc>
+          <w:tcPr>
+            <w:tcW w:w="14398" w:type="dxa"/>
+            <w:tcBorders>
+              <w:top w:val="single" w:sz="4" w:space="0" w:color="A6A6A6"/>
+              <w:left w:val="single" w:sz="4" w:space="0" w:color="A6A6A6"/>
+              <w:bottom w:val="single" w:sz="4" w:space="0" w:color="A6A6A6"/>
+              <w:right w:val="single" w:sz="4" w:space="0" w:color="A6A6A6"/>
+            </w:tcBorders>
+            <w:tcMar>
+              <w:top w:w="70" w:type="dxa"/>
+              <w:left w:w="110" w:type="dxa"/>
+              <w:bottom w:w="70" w:type="dxa"/>
+              <w:right w:w="110" w:type="dxa"/>
+            </w:tcMar>
+          </w:tcPr>
+          <w:p>
+            <w:pPr>
+              <w:spacing w:after="40"/>
+            </w:pPr>
+            <w:r>
+              <w:t>The coordinator confirms the allocation.</w:t>
+            </w:r>
+          </w:p>
+        </w:tc>
+      </w:tr>
+      <w:tr>
+        <w:tblPrEx>
+          <w:tblCellMar>
+            <w:top w:w="0" w:type="dxa"/>
+            <w:bottom w:w="0" w:type="dxa"/>
+          </w:tblCellMar>
+        </w:tblPrEx>
+        <w:trPr>
+          <w:cantSplit/>
+        </w:trPr>
+        <w:tc>
+          <w:tcPr>
+            <w:tcW w:w="1000" w:type="dxa"/>
+            <w:tcBorders>
+              <w:top w:val="single" w:sz="4" w:space="0" w:color="A6A6A6"/>
+              <w:left w:val="single" w:sz="4" w:space="0" w:color="A6A6A6"/>
+              <w:bottom w:val="single" w:sz="4" w:space="0" w:color="A6A6A6"/>
+              <w:right w:val="single" w:sz="4" w:space="0" w:color="A6A6A6"/>
+            </w:tcBorders>
+            <w:tcMar>
+              <w:top w:w="70" w:type="dxa"/>
+              <w:left w:w="110" w:type="dxa"/>
+              <w:bottom w:w="70" w:type="dxa"/>
+              <w:right w:w="110" w:type="dxa"/>
+            </w:tcMar>
+          </w:tcPr>
+          <w:p>
+            <w:pPr>
+              <w:spacing w:after="40"/>
+            </w:pPr>
+            <w:r>
+              <w:t>9</w:t>
+            </w:r>
+          </w:p>
+        </w:tc>
+        <w:tc>
+          <w:tcPr>
+            <w:tcW w:w="14398" w:type="dxa"/>
+            <w:tcBorders>
+              <w:top w:val="single" w:sz="4" w:space="0" w:color="A6A6A6"/>
+              <w:left w:val="single" w:sz="4" w:space="0" w:color="A6A6A6"/>
+              <w:bottom w:val="single" w:sz="4" w:space="0" w:color="A6A6A6"/>
+              <w:right w:val="single" w:sz="4" w:space="0" w:color="A6A6A6"/>
+            </w:tcBorders>
+            <w:tcMar>
+              <w:top w:w="70" w:type="dxa"/>
+              <w:left w:w="110" w:type="dxa"/>
+              <w:bottom w:w="70" w:type="dxa"/>
+              <w:right w:w="110" w:type="dxa"/>
+            </w:tcMar>
+          </w:tcPr>
+          <w:p>
+            <w:pPr>
+              <w:spacing w:after="40"/>
+            </w:pPr>
+            <w:r>
+              <w:t>The system records the berth on the request for the requested time.</w:t>
+            </w:r>
+          </w:p>
+        </w:tc>
+      </w:tr>
+      <w:tr>
+        <w:tblPrEx>
+          <w:tblCellMar>
+            <w:top w:w="0" w:type="dxa"/>
+            <w:bottom w:w="0" w:type="dxa"/>
+          </w:tblCellMar>
+        </w:tblPrEx>
+        <w:trPr>
+          <w:cantSplit/>
+        </w:trPr>
+        <w:tc>
+          <w:tcPr>
+            <w:tcW w:w="1000" w:type="dxa"/>
+            <w:tcBorders>
+              <w:top w:val="single" w:sz="4" w:space="0" w:color="A6A6A6"/>
+              <w:left w:val="single" w:sz="4" w:space="0" w:color="A6A6A6"/>
+              <w:bottom w:val="single" w:sz="4" w:space="0" w:color="A6A6A6"/>
+              <w:right w:val="single" w:sz="4" w:space="0" w:color="A6A6A6"/>
+            </w:tcBorders>
+            <w:tcMar>
+              <w:top w:w="70" w:type="dxa"/>
+              <w:left w:w="110" w:type="dxa"/>
+              <w:bottom w:w="70" w:type="dxa"/>
+              <w:right w:w="110" w:type="dxa"/>
+            </w:tcMar>
+          </w:tcPr>
+          <w:p>
+            <w:pPr>
+              <w:spacing w:after="40"/>
+            </w:pPr>
+            <w:r>
+              <w:t>10</w:t>
+            </w:r>
+          </w:p>
+        </w:tc>
+        <w:tc>
+          <w:tcPr>
+            <w:tcW w:w="14398" w:type="dxa"/>
+            <w:tcBorders>
+              <w:top w:val="single" w:sz="4" w:space="0" w:color="A6A6A6"/>
+              <w:left w:val="single" w:sz="4" w:space="0" w:color="A6A6A6"/>
+              <w:bottom w:val="single" w:sz="4" w:space="0" w:color="A6A6A6"/>
+              <w:right w:val="single" w:sz="4" w:space="0" w:color="A6A6A6"/>
+            </w:tcBorders>
+            <w:tcMar>
+              <w:top w:w="70" w:type="dxa"/>
+              <w:left w:w="110" w:type="dxa"/>
+              <w:bottom w:w="70" w:type="dxa"/>
+              <w:right w:w="110" w:type="dxa"/>
+            </w:tcMar>
+          </w:tcPr>
+          <w:p>
+            <w:pPr>
+              <w:spacing w:after="40"/>
+            </w:pPr>
+            <w:r>
+              <w:t>The system shows the berth as allocated for that time.</w:t>
+            </w:r>
+          </w:p>
+        </w:tc>
+      </w:tr>
+    </w:tbl>
+    <w:p>
+      <w:pPr>
+        <w:keepNext/>
+        <w:spacing w:before="200" w:after="80"/>
+      </w:pPr>
+      <w:r>
+        <w:rPr>
+          <w:b/>
+          <w:bCs/>
+          <w:color w:val="404040"/>
+          <w:sz w:val="22"/>
+          <w:szCs w:val="22"/>
+        </w:rPr>
+        <w:t>6.3.3 Extensions</w:t>
+      </w:r>
+    </w:p>
+    <w:tbl>
+      <w:tblPr>
+        <w:tblW w:w="15398" w:type="dxa"/>
+        <w:tblBorders>
+          <w:top w:val="single" w:sz="4" w:space="0" w:color="auto"/>
+          <w:left w:val="single" w:sz="4" w:space="0" w:color="auto"/>
+          <w:bottom w:val="single" w:sz="4" w:space="0" w:color="auto"/>
+          <w:right w:val="single" w:sz="4" w:space="0" w:color="auto"/>
+          <w:insideH w:val="single" w:sz="4" w:space="0" w:color="auto"/>
+          <w:insideV w:val="single" w:sz="4" w:space="0" w:color="auto"/>
+        </w:tblBorders>
+        <w:tblCellMar>
+          <w:left w:w="10" w:type="dxa"/>
+          <w:right w:w="10" w:type="dxa"/>
+        </w:tblCellMar>
+        <w:tblLook w:val="0000" w:firstRow="0" w:lastRow="0" w:firstColumn="0" w:lastColumn="0" w:noHBand="0" w:noVBand="0"/>
+      </w:tblPr>
+      <w:tblGrid>
+        <w:gridCol w:w="1000"/>
+        <w:gridCol w:w="6000"/>
+        <w:gridCol w:w="8398"/>
+      </w:tblGrid>
+      <w:tr>
+        <w:tblPrEx>
+          <w:tblCellMar>
+            <w:top w:w="0" w:type="dxa"/>
+            <w:bottom w:w="0" w:type="dxa"/>
+          </w:tblCellMar>
+        </w:tblPrEx>
+        <w:trPr>
+          <w:tblHeader/>
+        </w:trPr>
+        <w:tc>
+          <w:tcPr>
+            <w:tcW w:w="1000" w:type="dxa"/>
+            <w:tcBorders>
+              <w:top w:val="single" w:sz="4" w:space="0" w:color="A6A6A6"/>
+              <w:left w:val="single" w:sz="4" w:space="0" w:color="A6A6A6"/>
+              <w:bottom w:val="single" w:sz="4" w:space="0" w:color="A6A6A6"/>
+              <w:right w:val="single" w:sz="4" w:space="0" w:color="A6A6A6"/>
+            </w:tcBorders>
+            <w:shd w:val="clear" w:color="auto" w:fill="D9D9D9"/>
+            <w:tcMar>
+              <w:top w:w="70" w:type="dxa"/>
+              <w:left w:w="110" w:type="dxa"/>
+              <w:bottom w:w="70" w:type="dxa"/>
+              <w:right w:w="110" w:type="dxa"/>
+            </w:tcMar>
+          </w:tcPr>
+          <w:p>
+            <w:pPr>
+              <w:spacing w:after="40"/>
+            </w:pPr>
+            <w:r>
+              <w:rPr>
+                <w:b/>
+                <w:bCs/>
+              </w:rPr>
+              <w:t>Ref.</w:t>
+            </w:r>
+          </w:p>
+        </w:tc>
+        <w:tc>
+          <w:tcPr>
+            <w:tcW w:w="6000" w:type="dxa"/>
+            <w:tcBorders>
+              <w:top w:val="single" w:sz="4" w:space="0" w:color="A6A6A6"/>
+              <w:left w:val="single" w:sz="4" w:space="0" w:color="A6A6A6"/>
+              <w:bottom w:val="single" w:sz="4" w:space="0" w:color="A6A6A6"/>
+              <w:right w:val="single" w:sz="4" w:space="0" w:color="A6A6A6"/>
+            </w:tcBorders>
+            <w:shd w:val="clear" w:color="auto" w:fill="D9D9D9"/>
+            <w:tcMar>
+              <w:top w:w="70" w:type="dxa"/>
+              <w:left w:w="110" w:type="dxa"/>
+              <w:bottom w:w="70" w:type="dxa"/>
+              <w:right w:w="110" w:type="dxa"/>
+            </w:tcMar>
+          </w:tcPr>
+          <w:p>
+            <w:pPr>
+              <w:spacing w:after="40"/>
+            </w:pPr>
+            <w:r>
+              <w:rPr>
+                <w:b/>
+                <w:bCs/>
+              </w:rPr>
+              <w:t>Condition</w:t>
+            </w:r>
+          </w:p>
+        </w:tc>
+        <w:tc>
+          <w:tcPr>
+            <w:tcW w:w="8398" w:type="dxa"/>
+            <w:tcBorders>
+              <w:top w:val="single" w:sz="4" w:space="0" w:color="A6A6A6"/>
+              <w:left w:val="single" w:sz="4" w:space="0" w:color="A6A6A6"/>
+              <w:bottom w:val="single" w:sz="4" w:space="0" w:color="A6A6A6"/>
+              <w:right w:val="single" w:sz="4" w:space="0" w:color="A6A6A6"/>
+            </w:tcBorders>
+            <w:shd w:val="clear" w:color="auto" w:fill="D9D9D9"/>
+            <w:tcMar>
+              <w:top w:w="70" w:type="dxa"/>
+              <w:left w:w="110" w:type="dxa"/>
+              <w:bottom w:w="70" w:type="dxa"/>
+              <w:right w:w="110" w:type="dxa"/>
+            </w:tcMar>
+          </w:tcPr>
+          <w:p>
+            <w:pPr>
+              <w:spacing w:after="40"/>
+            </w:pPr>
+            <w:r>
+              <w:rPr>
+                <w:b/>
+                <w:bCs/>
+              </w:rPr>
+              <w:t>Response and destination</w:t>
+            </w:r>
+          </w:p>
+        </w:tc>
+      </w:tr>
+      <w:tr>
+        <w:tblPrEx>
+          <w:tblCellMar>
+            <w:top w:w="0" w:type="dxa"/>
+            <w:bottom w:w="0" w:type="dxa"/>
+          </w:tblCellMar>
+        </w:tblPrEx>
+        <w:trPr>
+          <w:cantSplit/>
+        </w:trPr>
+        <w:tc>
+          <w:tcPr>
+            <w:tcW w:w="1000" w:type="dxa"/>
+            <w:tcBorders>
+              <w:top w:val="single" w:sz="4" w:space="0" w:color="A6A6A6"/>
+              <w:left w:val="single" w:sz="4" w:space="0" w:color="A6A6A6"/>
+              <w:bottom w:val="single" w:sz="4" w:space="0" w:color="A6A6A6"/>
+              <w:right w:val="single" w:sz="4" w:space="0" w:color="A6A6A6"/>
+            </w:tcBorders>
+            <w:tcMar>
+              <w:top w:w="70" w:type="dxa"/>
+              <w:left w:w="110" w:type="dxa"/>
+              <w:bottom w:w="70" w:type="dxa"/>
+              <w:right w:w="110" w:type="dxa"/>
+            </w:tcMar>
+          </w:tcPr>
+          <w:p>
+            <w:pPr>
+              <w:spacing w:after="40"/>
+            </w:pPr>
+            <w:r>
+              <w:t>3a</w:t>
+            </w:r>
+          </w:p>
+        </w:tc>
+        <w:tc>
+          <w:tcPr>
+            <w:tcW w:w="6000" w:type="dxa"/>
+            <w:tcBorders>
+              <w:top w:val="single" w:sz="4" w:space="0" w:color="A6A6A6"/>
+              <w:left w:val="single" w:sz="4" w:space="0" w:color="A6A6A6"/>
+              <w:bottom w:val="single" w:sz="4" w:space="0" w:color="A6A6A6"/>
+              <w:right w:val="single" w:sz="4" w:space="0" w:color="A6A6A6"/>
+            </w:tcBorders>
+            <w:tcMar>
+              <w:top w:w="70" w:type="dxa"/>
+              <w:left w:w="110" w:type="dxa"/>
+              <w:bottom w:w="70" w:type="dxa"/>
+              <w:right w:w="110" w:type="dxa"/>
+            </w:tcMar>
+          </w:tcPr>
+          <w:p>
+            <w:pPr>
+              <w:spacing w:after="40"/>
+            </w:pPr>
+            <w:r>
+              <w:t>No berth fits the vessel or offers the services needed.</w:t>
+            </w:r>
+          </w:p>
+        </w:tc>
+        <w:tc>
+          <w:tcPr>
+            <w:tcW w:w="8398" w:type="dxa"/>
+            <w:tcBorders>
+              <w:top w:val="single" w:sz="4" w:space="0" w:color="A6A6A6"/>
+              <w:left w:val="single" w:sz="4" w:space="0" w:color="A6A6A6"/>
+              <w:bottom w:val="single" w:sz="4" w:space="0" w:color="A6A6A6"/>
+              <w:right w:val="single" w:sz="4" w:space="0" w:color="A6A6A6"/>
+            </w:tcBorders>
+            <w:tcMar>
+              <w:top w:w="70" w:type="dxa"/>
+              <w:left w:w="110" w:type="dxa"/>
+              <w:bottom w:w="70" w:type="dxa"/>
+              <w:right w:w="110" w:type="dxa"/>
+            </w:tcMar>
+          </w:tcPr>
+          <w:p>
+            <w:pPr>
+              <w:spacing w:after="40"/>
+            </w:pPr>
+            <w:r>
+              <w:t>Explain that no suitable berth exists; allocate no berth; end.</w:t>
+            </w:r>
+          </w:p>
+        </w:tc>
+      </w:tr>
+      <w:tr>
+        <w:tblPrEx>
+          <w:tblCellMar>
+            <w:top w:w="0" w:type="dxa"/>
+            <w:bottom w:w="0" w:type="dxa"/>
+          </w:tblCellMar>
+        </w:tblPrEx>
+        <w:trPr>
+          <w:cantSplit/>
+        </w:trPr>
+        <w:tc>
+          <w:tcPr>
+            <w:tcW w:w="1000" w:type="dxa"/>
+            <w:tcBorders>
+              <w:top w:val="single" w:sz="4" w:space="0" w:color="A6A6A6"/>
+              <w:left w:val="single" w:sz="4" w:space="0" w:color="A6A6A6"/>
+              <w:bottom w:val="single" w:sz="4" w:space="0" w:color="A6A6A6"/>
+              <w:right w:val="single" w:sz="4" w:space="0" w:color="A6A6A6"/>
+            </w:tcBorders>
+            <w:tcMar>
+              <w:top w:w="70" w:type="dxa"/>
+              <w:left w:w="110" w:type="dxa"/>
+              <w:bottom w:w="70" w:type="dxa"/>
+              <w:right w:w="110" w:type="dxa"/>
+            </w:tcMar>
+          </w:tcPr>
+          <w:p>
+            <w:pPr>
+              <w:spacing w:after="40"/>
+            </w:pPr>
+            <w:r>
+              <w:t>4a</w:t>
+            </w:r>
+          </w:p>
+        </w:tc>
+        <w:tc>
+          <w:tcPr>
+            <w:tcW w:w="6000" w:type="dxa"/>
+            <w:tcBorders>
+              <w:top w:val="single" w:sz="4" w:space="0" w:color="A6A6A6"/>
+              <w:left w:val="single" w:sz="4" w:space="0" w:color="A6A6A6"/>
+              <w:bottom w:val="single" w:sz="4" w:space="0" w:color="A6A6A6"/>
+              <w:right w:val="single" w:sz="4" w:space="0" w:color="A6A6A6"/>
+            </w:tcBorders>
+            <w:tcMar>
+              <w:top w:w="70" w:type="dxa"/>
+              <w:left w:w="110" w:type="dxa"/>
+              <w:bottom w:w="70" w:type="dxa"/>
+              <w:right w:w="110" w:type="dxa"/>
+            </w:tcMar>
+          </w:tcPr>
+          <w:p>
+            <w:pPr>
+              <w:spacing w:after="40"/>
+            </w:pPr>
+            <w:r>
+              <w:t>All suitable berths are allocated or held for part of the requested time.</w:t>
+            </w:r>
+          </w:p>
+        </w:tc>
+        <w:tc>
+          <w:tcPr>
+            <w:tcW w:w="8398" w:type="dxa"/>
+            <w:tcBorders>
+              <w:top w:val="single" w:sz="4" w:space="0" w:color="A6A6A6"/>
+              <w:left w:val="single" w:sz="4" w:space="0" w:color="A6A6A6"/>
+              <w:bottom w:val="single" w:sz="4" w:space="0" w:color="A6A6A6"/>
+              <w:right w:val="single" w:sz="4" w:space="0" w:color="A6A6A6"/>
+            </w:tcBorders>
+            <w:tcMar>
+              <w:top w:w="70" w:type="dxa"/>
+              <w:left w:w="110" w:type="dxa"/>
+              <w:bottom w:w="70" w:type="dxa"/>
+              <w:right w:w="110" w:type="dxa"/>
+            </w:tcMar>
+          </w:tcPr>
+          <w:p>
+            <w:pPr>
+              <w:spacing w:after="40"/>
+            </w:pPr>
+            <w:r>
+              <w:t>Show the berths and the time that overlaps. If the operator agrees a revised time, the request is updated (UC02) and the flow resumes at step 3; otherwise allocate no berth; end.</w:t>
+            </w:r>
+          </w:p>
+        </w:tc>
+      </w:tr>
+      <w:tr>
+        <w:tblPrEx>
+          <w:tblCellMar>
+            <w:top w:w="0" w:type="dxa"/>
+            <w:bottom w:w="0" w:type="dxa"/>
+          </w:tblCellMar>
+        </w:tblPrEx>
+        <w:trPr>
+          <w:cantSplit/>
+        </w:trPr>
+        <w:tc>
+          <w:tcPr>
+            <w:tcW w:w="1000" w:type="dxa"/>
+            <w:tcBorders>
+              <w:top w:val="single" w:sz="4" w:space="0" w:color="A6A6A6"/>
+              <w:left w:val="single" w:sz="4" w:space="0" w:color="A6A6A6"/>
+              <w:bottom w:val="single" w:sz="4" w:space="0" w:color="A6A6A6"/>
+              <w:right w:val="single" w:sz="4" w:space="0" w:color="A6A6A6"/>
+            </w:tcBorders>
+            <w:tcMar>
+              <w:top w:w="70" w:type="dxa"/>
+              <w:left w:w="110" w:type="dxa"/>
+              <w:bottom w:w="70" w:type="dxa"/>
+              <w:right w:w="110" w:type="dxa"/>
+            </w:tcMar>
+          </w:tcPr>
+          <w:p>
+            <w:pPr>
+              <w:spacing w:after="40"/>
+            </w:pPr>
+            <w:r>
+              <w:t>5a</w:t>
+            </w:r>
+          </w:p>
+        </w:tc>
+        <w:tc>
+          <w:tcPr>
+            <w:tcW w:w="6000" w:type="dxa"/>
+            <w:tcBorders>
+              <w:top w:val="single" w:sz="4" w:space="0" w:color="A6A6A6"/>
+              <w:left w:val="single" w:sz="4" w:space="0" w:color="A6A6A6"/>
+              <w:bottom w:val="single" w:sz="4" w:space="0" w:color="A6A6A6"/>
+              <w:right w:val="single" w:sz="4" w:space="0" w:color="A6A6A6"/>
+            </w:tcBorders>
+            <w:tcMar>
+              <w:top w:w="70" w:type="dxa"/>
+              <w:left w:w="110" w:type="dxa"/>
+              <w:bottom w:w="70" w:type="dxa"/>
+              <w:right w:w="110" w:type="dxa"/>
+            </w:tcMar>
+          </w:tcPr>
+          <w:p>
+            <w:pPr>
+              <w:spacing w:after="40"/>
+            </w:pPr>
+            <w:r>
+              <w:t>A restriction or works affects a suitable berth for part of the requested time.</w:t>
+            </w:r>
+          </w:p>
+        </w:tc>
+        <w:tc>
+          <w:tcPr>
+            <w:tcW w:w="8398" w:type="dxa"/>
+            <w:tcBorders>
+              <w:top w:val="single" w:sz="4" w:space="0" w:color="A6A6A6"/>
+              <w:left w:val="single" w:sz="4" w:space="0" w:color="A6A6A6"/>
+              <w:bottom w:val="single" w:sz="4" w:space="0" w:color="A6A6A6"/>
+              <w:right w:val="single" w:sz="4" w:space="0" w:color="A6A6A6"/>
+            </w:tcBorders>
+            <w:tcMar>
+              <w:top w:w="70" w:type="dxa"/>
+              <w:left w:w="110" w:type="dxa"/>
+              <w:bottom w:w="70" w:type="dxa"/>
+              <w:right w:w="110" w:type="dxa"/>
+            </w:tcMar>
+          </w:tcPr>
+          <w:p>
+            <w:pPr>
+              <w:spacing w:after="40"/>
+            </w:pPr>
+            <w:r>
+              <w:t>Show the restriction; leave that berth out; resume at step 6 with the other berths. If no berth is left, continue as 3a.</w:t>
+            </w:r>
+          </w:p>
+        </w:tc>
+      </w:tr>
+      <w:tr>
+        <w:tblPrEx>
+          <w:tblCellMar>
+            <w:top w:w="0" w:type="dxa"/>
+            <w:bottom w:w="0" w:type="dxa"/>
+          </w:tblCellMar>
+        </w:tblPrEx>
+        <w:trPr>
+          <w:cantSplit/>
+        </w:trPr>
+        <w:tc>
+          <w:tcPr>
+            <w:tcW w:w="1000" w:type="dxa"/>
+            <w:tcBorders>
+              <w:top w:val="single" w:sz="4" w:space="0" w:color="A6A6A6"/>
+              <w:left w:val="single" w:sz="4" w:space="0" w:color="A6A6A6"/>
+              <w:bottom w:val="single" w:sz="4" w:space="0" w:color="A6A6A6"/>
+              <w:right w:val="single" w:sz="4" w:space="0" w:color="A6A6A6"/>
+            </w:tcBorders>
+            <w:tcMar>
+              <w:top w:w="70" w:type="dxa"/>
+              <w:left w:w="110" w:type="dxa"/>
+              <w:bottom w:w="70" w:type="dxa"/>
+              <w:right w:w="110" w:type="dxa"/>
+            </w:tcMar>
+          </w:tcPr>
+          <w:p>
+            <w:pPr>
+              <w:spacing w:after="40"/>
+            </w:pPr>
+            <w:r>
+              <w:t>8a</w:t>
+            </w:r>
+          </w:p>
+        </w:tc>
+        <w:tc>
+          <w:tcPr>
+            <w:tcW w:w="6000" w:type="dxa"/>
+            <w:tcBorders>
+              <w:top w:val="single" w:sz="4" w:space="0" w:color="A6A6A6"/>
+              <w:left w:val="single" w:sz="4" w:space="0" w:color="A6A6A6"/>
+              <w:bottom w:val="single" w:sz="4" w:space="0" w:color="A6A6A6"/>
+              <w:right w:val="single" w:sz="4" w:space="0" w:color="A6A6A6"/>
+            </w:tcBorders>
+            <w:tcMar>
+              <w:top w:w="70" w:type="dxa"/>
+              <w:left w:w="110" w:type="dxa"/>
+              <w:bottom w:w="70" w:type="dxa"/>
+              <w:right w:w="110" w:type="dxa"/>
+            </w:tcMar>
+          </w:tcPr>
+          <w:p>
+            <w:pPr>
+              <w:spacing w:after="40"/>
+            </w:pPr>
+            <w:r>
+              <w:t>The coordinator cancels before confirming.</w:t>
+            </w:r>
+          </w:p>
+        </w:tc>
+        <w:tc>
+          <w:tcPr>
+            <w:tcW w:w="8398" w:type="dxa"/>
+            <w:tcBorders>
+              <w:top w:val="single" w:sz="4" w:space="0" w:color="A6A6A6"/>
+              <w:left w:val="single" w:sz="4" w:space="0" w:color="A6A6A6"/>
+              <w:bottom w:val="single" w:sz="4" w:space="0" w:color="A6A6A6"/>
+              <w:right w:val="single" w:sz="4" w:space="0" w:color="A6A6A6"/>
+            </w:tcBorders>
+            <w:tcMar>
+              <w:top w:w="70" w:type="dxa"/>
+              <w:left w:w="110" w:type="dxa"/>
+              <w:bottom w:w="70" w:type="dxa"/>
+              <w:right w:w="110" w:type="dxa"/>
+            </w:tcMar>
+          </w:tcPr>
+          <w:p>
+            <w:pPr>
+              <w:spacing w:after="40"/>
+            </w:pPr>
+            <w:r>
+              <w:t>Allocate no berth; the request stays without a berth; end.</w:t>
+            </w:r>
+          </w:p>
+        </w:tc>
+      </w:tr>
+    </w:tbl>
+    <w:p>
+      <w:pPr>
+        <w:keepNext/>
+        <w:spacing w:before="200" w:after="80"/>
+      </w:pPr>
+      <w:r>
+        <w:rPr>
+          <w:b/>
+          <w:bCs/>
+          <w:color w:val="404040"/>
+          <w:sz w:val="22"/>
+          <w:szCs w:val="22"/>
+        </w:rPr>
+        <w:t>6.3.4 Quick classification check</w:t>
+      </w:r>
+    </w:p>
+    <w:p>
+      <w:pPr>
+        <w:pStyle w:val="ListParagraph"/>
+        <w:numPr>
+          <w:ilvl w:val="0"/>
+          <w:numId w:val="2"/>
+        </w:numPr>
+        <w:spacing w:after="60"/>
+      </w:pPr>
+      <w:r>
+        <w:t>3a is a failure extension.</w:t>
+      </w:r>
+    </w:p>
+    <w:p>
+      <w:pPr>
+        <w:pStyle w:val="ListParagraph"/>
+        <w:numPr>
+          <w:ilvl w:val="0"/>
+          <w:numId w:val="2"/>
+        </w:numPr>
+        <w:spacing w:after="60"/>
+      </w:pPr>
+      <w:r>
+        <w:t>4a and 5a are recoverable extensions.</w:t>
+      </w:r>
+    </w:p>
+    <w:p>
+      <w:pPr>
+        <w:pStyle w:val="ListParagraph"/>
+        <w:numPr>
+          <w:ilvl w:val="0"/>
+          <w:numId w:val="2"/>
+        </w:numPr>
+        <w:spacing w:after="60"/>
+      </w:pPr>
+      <w:r>
+        <w:t>8a is a cancellation extension.</w:t>
+      </w:r>
+    </w:p>
+    <w:p>
+      <w:pPr>
+        <w:spacing w:after="140"/>
+      </w:pPr>
+    </w:p>
     <w:sectPr>
-      <w:footerReference w:type="default" r:id="rId7"/>
+      <w:footerReference w:type="default" r:id="rId10"/>
       <w:pgSz w:w="16838" w:h="11906" w:orient="landscape"/>
       <w:pgMar w:top="864" w:right="720" w:bottom="864" w:left="720" w:header="708" w:footer="708" w:gutter="0"/>
       <w:cols w:space="720"/>
@@ -2446,6 +4616,108 @@
 </w:ftr>
 </file>
 
+<file path=word/footer2.xml><?xml version="1.0" encoding="utf-8"?>
+<w:ftr xmlns:wpc="http://schemas.microsoft.com/office/word/2010/wordprocessingCanvas" xmlns:cx="http://schemas.microsoft.com/office/drawing/2014/chartex" xmlns:cx1="http://schemas.microsoft.com/office/drawing/2015/9/8/chartex" xmlns:cx2="http://schemas.microsoft.com/office/drawing/2015/10/21/chartex" xmlns:cx3="http://schemas.microsoft.com/office/drawing/2016/5/9/chartex" xmlns:cx4="http://schemas.microsoft.com/office/drawing/2016/5/10/chartex" xmlns:cx5="http://schemas.microsoft.com/office/drawing/2016/5/11/chartex" xmlns:cx6="http://schemas.microsoft.com/office/drawing/2016/5/12/chartex" xmlns:cx7="http://schemas.microsoft.com/office/drawing/2016/5/13/chartex" xmlns:cx8="http://schemas.microsoft.com/office/drawing/2016/5/14/chartex" xmlns:mc="http://schemas.openxmlformats.org/markup-compatibility/2006" xmlns:m="http://schemas.openxmlformats.org/officeDocument/2006/math" xmlns:aink="http://schemas.microsoft.com/office/drawing/2016/ink" xmlns:am3d="http://schemas.microsoft.com/office/drawing/2017/model3d" xmlns:oel="http://schemas.microsoft.com/office/2019/extlst" xmlns:r="http://schemas.openxmlformats.org/officeDocument/2006/relationships" xmlns:wp14="http://schemas.microsoft.com/office/word/2010/wordprocessingDrawing" xmlns:wp="http://schemas.openxmlformats.org/drawingml/2006/wordprocessingDrawing" xmlns:wpg="http://schemas.microsoft.com/office/word/2010/wordprocessingGroup" xmlns:wpi="http://schemas.microsoft.com/office/word/2010/wordprocessingInk" xmlns:wps="http://schemas.microsoft.com/office/word/2010/wordprocessingShape" xmlns:o="urn:schemas-microsoft-com:office:office" xmlns:v="urn:schemas-microsoft-com:vml" xmlns:w10="urn:schemas-microsoft-com:office:word" xmlns:w="http://schemas.openxmlformats.org/wordprocessingml/2006/main" xmlns:w14="http://schemas.microsoft.com/office/word/2010/wordml" xmlns:w15="http://schemas.microsoft.com/office/word/2012/wordml" xmlns:w16cex="http://schemas.microsoft.com/office/word/2018/wordml/cex" xmlns:w16cid="http://schemas.microsoft.com/office/word/2016/wordml/cid" xmlns:w16="http://schemas.microsoft.com/office/word/2018/wordml" xmlns:w16sdtdh="http://schemas.microsoft.com/office/word/2020/wordml/sdtdatahash" xmlns:w16sdtfl="http://schemas.microsoft.com/office/word/2024/wordml/sdtformatlock" xmlns:w16se="http://schemas.microsoft.com/office/word/2015/wordml/symex" xmlns:w16du="http://schemas.microsoft.com/office/word/2023/wordml/word16du" xmlns:wne="http://schemas.microsoft.com/office/word/2006/wordml" mc:Ignorable="w14 w15 w16se w16cid w16 w16cex w16sdtdh w16sdtfl w16du wp14">
+  <w:p>
+    <w:pPr>
+      <w:jc w:val="right"/>
+    </w:pPr>
+    <w:r>
+      <w:rPr>
+        <w:color w:val="808080"/>
+        <w:sz w:val="18"/>
+        <w:szCs w:val="18"/>
+      </w:rPr>
+      <w:fldChar w:fldCharType="begin"/>
+    </w:r>
+    <w:r>
+      <w:rPr>
+        <w:color w:val="808080"/>
+        <w:sz w:val="18"/>
+        <w:szCs w:val="18"/>
+      </w:rPr>
+      <w:instrText>PAGE</w:instrText>
+    </w:r>
+    <w:r>
+      <w:rPr>
+        <w:color w:val="808080"/>
+        <w:sz w:val="18"/>
+        <w:szCs w:val="18"/>
+      </w:rPr>
+      <w:fldChar w:fldCharType="separate"/>
+    </w:r>
+    <w:r>
+      <w:rPr>
+        <w:noProof/>
+        <w:color w:val="808080"/>
+        <w:sz w:val="18"/>
+        <w:szCs w:val="18"/>
+      </w:rPr>
+      <w:t>3</w:t>
+    </w:r>
+    <w:r>
+      <w:rPr>
+        <w:color w:val="808080"/>
+        <w:sz w:val="18"/>
+        <w:szCs w:val="18"/>
+      </w:rPr>
+      <w:fldChar w:fldCharType="end"/>
+    </w:r>
+  </w:p>
+</w:ftr>
+</file>
+
+<file path=word/footer3.xml><?xml version="1.0" encoding="utf-8"?>
+<w:ftr xmlns:wpc="http://schemas.microsoft.com/office/word/2010/wordprocessingCanvas" xmlns:cx="http://schemas.microsoft.com/office/drawing/2014/chartex" xmlns:cx1="http://schemas.microsoft.com/office/drawing/2015/9/8/chartex" xmlns:cx2="http://schemas.microsoft.com/office/drawing/2015/10/21/chartex" xmlns:cx3="http://schemas.microsoft.com/office/drawing/2016/5/9/chartex" xmlns:cx4="http://schemas.microsoft.com/office/drawing/2016/5/10/chartex" xmlns:cx5="http://schemas.microsoft.com/office/drawing/2016/5/11/chartex" xmlns:cx6="http://schemas.microsoft.com/office/drawing/2016/5/12/chartex" xmlns:cx7="http://schemas.microsoft.com/office/drawing/2016/5/13/chartex" xmlns:cx8="http://schemas.microsoft.com/office/drawing/2016/5/14/chartex" xmlns:mc="http://schemas.openxmlformats.org/markup-compatibility/2006" xmlns:m="http://schemas.openxmlformats.org/officeDocument/2006/math" xmlns:aink="http://schemas.microsoft.com/office/drawing/2016/ink" xmlns:am3d="http://schemas.microsoft.com/office/drawing/2017/model3d" xmlns:oel="http://schemas.microsoft.com/office/2019/extlst" xmlns:r="http://schemas.openxmlformats.org/officeDocument/2006/relationships" xmlns:wp14="http://schemas.microsoft.com/office/word/2010/wordprocessingDrawing" xmlns:wp="http://schemas.openxmlformats.org/drawingml/2006/wordprocessingDrawing" xmlns:wpg="http://schemas.microsoft.com/office/word/2010/wordprocessingGroup" xmlns:wpi="http://schemas.microsoft.com/office/word/2010/wordprocessingInk" xmlns:wps="http://schemas.microsoft.com/office/word/2010/wordprocessingShape" xmlns:o="urn:schemas-microsoft-com:office:office" xmlns:v="urn:schemas-microsoft-com:vml" xmlns:w10="urn:schemas-microsoft-com:office:word" xmlns:w="http://schemas.openxmlformats.org/wordprocessingml/2006/main" xmlns:w14="http://schemas.microsoft.com/office/word/2010/wordml" xmlns:w15="http://schemas.microsoft.com/office/word/2012/wordml" xmlns:w16cex="http://schemas.microsoft.com/office/word/2018/wordml/cex" xmlns:w16cid="http://schemas.microsoft.com/office/word/2016/wordml/cid" xmlns:w16="http://schemas.microsoft.com/office/word/2018/wordml" xmlns:w16sdtdh="http://schemas.microsoft.com/office/word/2020/wordml/sdtdatahash" xmlns:w16sdtfl="http://schemas.microsoft.com/office/word/2024/wordml/sdtformatlock" xmlns:w16se="http://schemas.microsoft.com/office/word/2015/wordml/symex" xmlns:w16du="http://schemas.microsoft.com/office/word/2023/wordml/word16du" xmlns:wne="http://schemas.microsoft.com/office/word/2006/wordml" mc:Ignorable="w14 w15 w16se w16cid w16 w16cex w16sdtdh w16sdtfl w16du wp14">
+  <w:p>
+    <w:pPr>
+      <w:jc w:val="right"/>
+    </w:pPr>
+    <w:r>
+      <w:rPr>
+        <w:color w:val="808080"/>
+        <w:sz w:val="18"/>
+        <w:szCs w:val="18"/>
+      </w:rPr>
+      <w:fldChar w:fldCharType="begin"/>
+    </w:r>
+    <w:r>
+      <w:rPr>
+        <w:color w:val="808080"/>
+        <w:sz w:val="18"/>
+        <w:szCs w:val="18"/>
+      </w:rPr>
+      <w:instrText>PAGE</w:instrText>
+    </w:r>
+    <w:r>
+      <w:rPr>
+        <w:color w:val="808080"/>
+        <w:sz w:val="18"/>
+        <w:szCs w:val="18"/>
+      </w:rPr>
+      <w:fldChar w:fldCharType="separate"/>
+    </w:r>
+    <w:r>
+      <w:rPr>
+        <w:noProof/>
+        <w:color w:val="808080"/>
+        <w:sz w:val="18"/>
+        <w:szCs w:val="18"/>
+      </w:rPr>
+      <w:t>4</w:t>
+    </w:r>
+    <w:r>
+      <w:rPr>
+        <w:color w:val="808080"/>
+        <w:sz w:val="18"/>
+        <w:szCs w:val="18"/>
+      </w:rPr>
+      <w:fldChar w:fldCharType="end"/>
+    </w:r>
+  </w:p>
+</w:ftr>
+</file>
+
 <file path=word/footnotes.xml><?xml version="1.0" encoding="utf-8"?>
 <w:footnotes xmlns:wpc="http://schemas.microsoft.com/office/word/2010/wordprocessingCanvas" xmlns:cx="http://schemas.microsoft.com/office/drawing/2014/chartex" xmlns:cx1="http://schemas.microsoft.com/office/drawing/2015/9/8/chartex" xmlns:cx2="http://schemas.microsoft.com/office/drawing/2015/10/21/chartex" xmlns:cx3="http://schemas.microsoft.com/office/drawing/2016/5/9/chartex" xmlns:cx4="http://schemas.microsoft.com/office/drawing/2016/5/10/chartex" xmlns:cx5="http://schemas.microsoft.com/office/drawing/2016/5/11/chartex" xmlns:cx6="http://schemas.microsoft.com/office/drawing/2016/5/12/chartex" xmlns:cx7="http://schemas.microsoft.com/office/drawing/2016/5/13/chartex" xmlns:cx8="http://schemas.microsoft.com/office/drawing/2016/5/14/chartex" xmlns:mc="http://schemas.openxmlformats.org/markup-compatibility/2006" xmlns:m="http://schemas.openxmlformats.org/officeDocument/2006/math" xmlns:aink="http://schemas.microsoft.com/office/drawing/2016/ink" xmlns:am3d="http://schemas.microsoft.com/office/drawing/2017/model3d" xmlns:oel="http://schemas.microsoft.com/office/2019/extlst" xmlns:r="http://schemas.openxmlformats.org/officeDocument/2006/relationships" xmlns:wp14="http://schemas.microsoft.com/office/word/2010/wordprocessingDrawing" xmlns:wp="http://schemas.openxmlformats.org/drawingml/2006/wordprocessingDrawing" xmlns:wpg="http://schemas.microsoft.com/office/word/2010/wordprocessingGroup" xmlns:wpi="http://schemas.microsoft.com/office/word/2010/wordprocessingInk" xmlns:wps="http://schemas.microsoft.com/office/word/2010/wordprocessingShape" xmlns:o="urn:schemas-microsoft-com:office:office" xmlns:v="urn:schemas-microsoft-com:vml" xmlns:w10="urn:schemas-microsoft-com:office:word" xmlns:w="http://schemas.openxmlformats.org/wordprocessingml/2006/main" xmlns:w14="http://schemas.microsoft.com/office/word/2010/wordml" xmlns:w15="http://schemas.microsoft.com/office/word/2012/wordml" xmlns:w16cex="http://schemas.microsoft.com/office/word/2018/wordml/cex" xmlns:w16cid="http://schemas.microsoft.com/office/word/2016/wordml/cid" xmlns:w16="http://schemas.microsoft.com/office/word/2018/wordml" xmlns:w16sdtdh="http://schemas.microsoft.com/office/word/2020/wordml/sdtdatahash" xmlns:w16sdtfl="http://schemas.microsoft.com/office/word/2024/wordml/sdtformatlock" xmlns:w16se="http://schemas.microsoft.com/office/word/2015/wordml/symex" xmlns:w16du="http://schemas.microsoft.com/office/word/2023/wordml/word16du" xmlns:wne="http://schemas.microsoft.com/office/word/2006/wordml" mc:Ignorable="w14 w15 w16se w16cid w16 w16cex w16sdtdh w16sdtfl w16du wp14">
   <w:footnote w:type="separator" w:id="-1">
@@ -2468,10 +4740,10 @@
 <file path=word/numbering.xml><?xml version="1.0" encoding="utf-8"?>
 <w:numbering xmlns:wpc="http://schemas.microsoft.com/office/word/2010/wordprocessingCanvas" xmlns:cx="http://schemas.microsoft.com/office/drawing/2014/chartex" xmlns:cx1="http://schemas.microsoft.com/office/drawing/2015/9/8/chartex" xmlns:cx2="http://schemas.microsoft.com/office/drawing/2015/10/21/chartex" xmlns:cx3="http://schemas.microsoft.com/office/drawing/2016/5/9/chartex" xmlns:cx4="http://schemas.microsoft.com/office/drawing/2016/5/10/chartex" xmlns:cx5="http://schemas.microsoft.com/office/drawing/2016/5/11/chartex" xmlns:cx6="http://schemas.microsoft.com/office/drawing/2016/5/12/chartex" xmlns:cx7="http://schemas.microsoft.com/office/drawing/2016/5/13/chartex" xmlns:cx8="http://schemas.microsoft.com/office/drawing/2016/5/14/chartex" xmlns:mc="http://schemas.openxmlformats.org/markup-compatibility/2006" xmlns:m="http://schemas.openxmlformats.org/officeDocument/2006/math" xmlns:aink="http://schemas.microsoft.com/office/drawing/2016/ink" xmlns:am3d="http://schemas.microsoft.com/office/drawing/2017/model3d" xmlns:oel="http://schemas.microsoft.com/office/2019/extlst" xmlns:r="http://schemas.openxmlformats.org/officeDocument/2006/relationships" xmlns:wp14="http://schemas.microsoft.com/office/word/2010/wordprocessingDrawing" xmlns:wp="http://schemas.openxmlformats.org/drawingml/2006/wordprocessingDrawing" xmlns:wpg="http://schemas.microsoft.com/office/word/2010/wordprocessingGroup" xmlns:wpi="http://schemas.microsoft.com/office/word/2010/wordprocessingInk" xmlns:wps="http://schemas.microsoft.com/office/word/2010/wordprocessingShape" xmlns:o="urn:schemas-microsoft-com:office:office" xmlns:v="urn:schemas-microsoft-com:vml" xmlns:w10="urn:schemas-microsoft-com:office:word" xmlns:w="http://schemas.openxmlformats.org/wordprocessingml/2006/main" xmlns:w14="http://schemas.microsoft.com/office/word/2010/wordml" xmlns:w15="http://schemas.microsoft.com/office/word/2012/wordml" xmlns:w16cex="http://schemas.microsoft.com/office/word/2018/wordml/cex" xmlns:w16cid="http://schemas.microsoft.com/office/word/2016/wordml/cid" xmlns:w16="http://schemas.microsoft.com/office/word/2018/wordml" xmlns:w16sdtdh="http://schemas.microsoft.com/office/word/2020/wordml/sdtdatahash" xmlns:w16sdtfl="http://schemas.microsoft.com/office/word/2024/wordml/sdtformatlock" xmlns:w16se="http://schemas.microsoft.com/office/word/2015/wordml/symex" xmlns:w16du="http://schemas.microsoft.com/office/word/2023/wordml/word16du" xmlns:wne="http://schemas.microsoft.com/office/word/2006/wordml" mc:Ignorable="w14 w15 w16se w16cid w16 w16cex w16sdtdh w16sdtfl w16du wp14">
   <w:abstractNum w:abstractNumId="0" w15:restartNumberingAfterBreak="0">
-    <w:nsid w:val="53A23982"/>
+    <w:nsid w:val="0F5F66F4"/>
     <w:multiLevelType w:val="hybridMultilevel"/>
-    <w:tmpl w:val="BCF6A782"/>
-    <w:lvl w:ilvl="0" w:tplc="C5C0F386">
+    <w:tmpl w:val="CBC00E8C"/>
+    <w:lvl w:ilvl="0" w:tplc="76AE5D22">
       <w:start w:val="1"/>
       <w:numFmt w:val="bullet"/>
       <w:lvlText w:val="●"/>
@@ -2480,7 +4752,7 @@
         <w:ind w:left="720" w:hanging="360"/>
       </w:pPr>
     </w:lvl>
-    <w:lvl w:ilvl="1" w:tplc="1F80D906">
+    <w:lvl w:ilvl="1" w:tplc="35F6A49E">
       <w:start w:val="1"/>
       <w:numFmt w:val="bullet"/>
       <w:lvlText w:val="○"/>
@@ -2489,7 +4761,7 @@
         <w:ind w:left="1440" w:hanging="360"/>
       </w:pPr>
     </w:lvl>
-    <w:lvl w:ilvl="2" w:tplc="7CFAF820">
+    <w:lvl w:ilvl="2" w:tplc="BE509BA8">
       <w:start w:val="1"/>
       <w:numFmt w:val="bullet"/>
       <w:lvlText w:val="■"/>
@@ -2498,7 +4770,7 @@
         <w:ind w:left="2160" w:hanging="360"/>
       </w:pPr>
     </w:lvl>
-    <w:lvl w:ilvl="3" w:tplc="7CFAF870">
+    <w:lvl w:ilvl="3" w:tplc="F362A176">
       <w:start w:val="1"/>
       <w:numFmt w:val="bullet"/>
       <w:lvlText w:val="●"/>
@@ -2507,7 +4779,7 @@
         <w:ind w:left="2880" w:hanging="360"/>
       </w:pPr>
     </w:lvl>
-    <w:lvl w:ilvl="4" w:tplc="8AF8DAFA">
+    <w:lvl w:ilvl="4" w:tplc="B63A75C4">
       <w:start w:val="1"/>
       <w:numFmt w:val="bullet"/>
       <w:lvlText w:val="○"/>
@@ -2516,7 +4788,7 @@
         <w:ind w:left="3600" w:hanging="360"/>
       </w:pPr>
     </w:lvl>
-    <w:lvl w:ilvl="5" w:tplc="4F40D6AA">
+    <w:lvl w:ilvl="5" w:tplc="3A66C196">
       <w:start w:val="1"/>
       <w:numFmt w:val="bullet"/>
       <w:lvlText w:val="■"/>
@@ -2525,7 +4797,7 @@
         <w:ind w:left="4320" w:hanging="360"/>
       </w:pPr>
     </w:lvl>
-    <w:lvl w:ilvl="6" w:tplc="C8CCF80E">
+    <w:lvl w:ilvl="6" w:tplc="3AEA72B4">
       <w:start w:val="1"/>
       <w:numFmt w:val="bullet"/>
       <w:lvlText w:val="●"/>
@@ -2534,7 +4806,7 @@
         <w:ind w:left="5040" w:hanging="360"/>
       </w:pPr>
     </w:lvl>
-    <w:lvl w:ilvl="7" w:tplc="E1A86CF2">
+    <w:lvl w:ilvl="7" w:tplc="E130725A">
       <w:start w:val="1"/>
       <w:numFmt w:val="bullet"/>
       <w:lvlText w:val="●"/>
@@ -2543,7 +4815,7 @@
         <w:ind w:left="5760" w:hanging="360"/>
       </w:pPr>
     </w:lvl>
-    <w:lvl w:ilvl="8" w:tplc="E0C44EB6">
+    <w:lvl w:ilvl="8" w:tplc="6218C9E8">
       <w:start w:val="1"/>
       <w:numFmt w:val="bullet"/>
       <w:lvlText w:val="●"/>
@@ -2553,8 +4825,68 @@
       </w:pPr>
     </w:lvl>
   </w:abstractNum>
-  <w:num w:numId="1" w16cid:durableId="1669792922">
+  <w:abstractNum w:abstractNumId="1" w15:restartNumberingAfterBreak="0">
+    <w:nsid w:val="6C5A745C"/>
+    <w:multiLevelType w:val="hybridMultilevel"/>
+    <w:tmpl w:val="5998A076"/>
+    <w:lvl w:ilvl="0" w:tplc="6A9A12BC">
+      <w:start w:val="1"/>
+      <w:numFmt w:val="bullet"/>
+      <w:lvlText w:val="•"/>
+      <w:lvlJc w:val="left"/>
+      <w:pPr>
+        <w:ind w:left="500" w:hanging="260"/>
+      </w:pPr>
+    </w:lvl>
+    <w:lvl w:ilvl="1" w:tplc="F9CA50D6">
+      <w:numFmt w:val="decimal"/>
+      <w:lvlText w:val=""/>
+      <w:lvlJc w:val="left"/>
+    </w:lvl>
+    <w:lvl w:ilvl="2" w:tplc="7B780F9A">
+      <w:numFmt w:val="decimal"/>
+      <w:lvlText w:val=""/>
+      <w:lvlJc w:val="left"/>
+    </w:lvl>
+    <w:lvl w:ilvl="3" w:tplc="0B38C7BC">
+      <w:numFmt w:val="decimal"/>
+      <w:lvlText w:val=""/>
+      <w:lvlJc w:val="left"/>
+    </w:lvl>
+    <w:lvl w:ilvl="4" w:tplc="FB0E0208">
+      <w:numFmt w:val="decimal"/>
+      <w:lvlText w:val=""/>
+      <w:lvlJc w:val="left"/>
+    </w:lvl>
+    <w:lvl w:ilvl="5" w:tplc="5CD0F720">
+      <w:numFmt w:val="decimal"/>
+      <w:lvlText w:val=""/>
+      <w:lvlJc w:val="left"/>
+    </w:lvl>
+    <w:lvl w:ilvl="6" w:tplc="1FC06138">
+      <w:numFmt w:val="decimal"/>
+      <w:lvlText w:val=""/>
+      <w:lvlJc w:val="left"/>
+    </w:lvl>
+    <w:lvl w:ilvl="7" w:tplc="308CB0B0">
+      <w:numFmt w:val="decimal"/>
+      <w:lvlText w:val=""/>
+      <w:lvlJc w:val="left"/>
+    </w:lvl>
+    <w:lvl w:ilvl="8" w:tplc="DED4FC2A">
+      <w:numFmt w:val="decimal"/>
+      <w:lvlText w:val=""/>
+      <w:lvlJc w:val="left"/>
+    </w:lvl>
+  </w:abstractNum>
+  <w:num w:numId="1" w16cid:durableId="1564097574">
     <w:abstractNumId w:val="0"/>
+    <w:lvlOverride w:ilvl="0">
+      <w:startOverride w:val="1"/>
+    </w:lvlOverride>
+  </w:num>
+  <w:num w:numId="2" w16cid:durableId="942886068">
+    <w:abstractNumId w:val="1"/>
     <w:lvlOverride w:ilvl="0">
       <w:startOverride w:val="1"/>
     </w:lvlOverride>

</xml_diff>